<commit_message>
Lengkapi lembar kerja: aplikasi counter, hot reload, dan refleksi
</commit_message>
<xml_diff>
--- a/dokumen/Lembar_Kerja_Praktikum_P1_4243250002.docx
+++ b/dokumen/Lembar_Kerja_Praktikum_P1_4243250002.docx
@@ -1510,7 +1510,7 @@
                 <w:rFonts w:ascii="Calibri" w:eastAsia="Times New Roman" w:hAnsi="Calibri" w:cs="Calibri"/>
                 <w:b/>
                 <w:bCs/>
-                <w:color w:val="B06000"/>
+                <w:color w:val="1B7A33"/>
                 <w:sz w:val="22"/>
                 <w:szCs w:val="22"/>
               </w:rPr>
@@ -1520,11 +1520,11 @@
                 <w:rFonts w:ascii="Segoe UI Symbol" w:eastAsia="Times New Roman" w:hAnsi="Segoe UI Symbol" w:cs="Segoe UI Symbol"/>
                 <w:b/>
                 <w:bCs/>
-                <w:color w:val="B06000"/>
-                <w:sz w:val="22"/>
-                <w:szCs w:val="22"/>
-              </w:rPr>
-              <w:t>☐</w:t>
+                <w:color w:val="1B7A33"/>
+                <w:sz w:val="22"/>
+                <w:szCs w:val="22"/>
+              </w:rPr>
+              <w:t>✓</w:t>
             </w:r>
           </w:p>
         </w:tc>
@@ -1632,7 +1632,23 @@
                 <w:sz w:val="22"/>
                 <w:szCs w:val="22"/>
               </w:rPr>
-              <w:t>. Aplikasi counter: ……………</w:t>
+              <w:t xml:space="preserve">. Aplikasi counter bawaan dijalankan di Xiaomi 15T (proyek </w:t>
+            </w:r>
+            <w:r>
+              <w:rPr>
+                <w:rStyle w:val="HTMLCode"/>
+                <w:color w:val="1A1A1A"/>
+              </w:rPr>
+              <w:t>coba_counter</w:t>
+            </w:r>
+            <w:r>
+              <w:rPr>
+                <w:rFonts w:ascii="Calibri" w:eastAsia="Times New Roman" w:hAnsi="Calibri" w:cs="Calibri"/>
+                <w:color w:val="1A1A1A"/>
+                <w:sz w:val="22"/>
+                <w:szCs w:val="22"/>
+              </w:rPr>
+              <w:t>); tombol + ditekan 5 kali.</w:t>
             </w:r>
           </w:p>
         </w:tc>
@@ -1663,7 +1679,7 @@
                 <w:rFonts w:ascii="Calibri" w:eastAsia="Times New Roman" w:hAnsi="Calibri" w:cs="Calibri"/>
                 <w:b/>
                 <w:bCs/>
-                <w:color w:val="B06000"/>
+                <w:color w:val="1B7A33"/>
                 <w:sz w:val="22"/>
                 <w:szCs w:val="22"/>
               </w:rPr>
@@ -1673,12 +1689,12 @@
                 <w:rFonts w:ascii="Segoe UI Symbol" w:eastAsia="Times New Roman" w:hAnsi="Segoe UI Symbol" w:cs="Segoe UI Symbol"/>
                 <w:b/>
                 <w:bCs/>
-                <w:color w:val="B06000"/>
+                <w:color w:val="1B7A33"/>
                 <w:sz w:val="22"/>
                 <w:szCs w:val="22"/>
               </w:rPr>
               <w:lastRenderedPageBreak/>
-              <w:t>☐</w:t>
+              <w:t>✓</w:t>
             </w:r>
           </w:p>
         </w:tc>
@@ -1749,12 +1765,51 @@
             </w:pPr>
             <w:r>
               <w:rPr>
-                <w:rFonts w:ascii="Calibri" w:eastAsia="Times New Roman" w:hAnsi="Calibri" w:cs="Calibri"/>
-                <w:color w:val="1A1A1A"/>
-                <w:sz w:val="22"/>
-                <w:szCs w:val="22"/>
-              </w:rPr>
-              <w:t>……………</w:t>
+                <w:rStyle w:val="HTMLCode"/>
+                <w:color w:val="1A1A1A"/>
+              </w:rPr>
+              <w:t>Colors.deepPurple</w:t>
+            </w:r>
+            <w:r>
+              <w:rPr>
+                <w:rFonts w:ascii="Calibri" w:eastAsia="Times New Roman" w:hAnsi="Calibri" w:cs="Calibri"/>
+                <w:color w:val="1A1A1A"/>
+                <w:sz w:val="22"/>
+                <w:szCs w:val="22"/>
+              </w:rPr>
+              <w:t xml:space="preserve"> diganti </w:t>
+            </w:r>
+            <w:r>
+              <w:rPr>
+                <w:rStyle w:val="HTMLCode"/>
+                <w:color w:val="1A1A1A"/>
+              </w:rPr>
+              <w:t>Colors.green</w:t>
+            </w:r>
+            <w:r>
+              <w:rPr>
+                <w:rFonts w:ascii="Calibri" w:eastAsia="Times New Roman" w:hAnsi="Calibri" w:cs="Calibri"/>
+                <w:color w:val="1A1A1A"/>
+                <w:sz w:val="22"/>
+                <w:szCs w:val="22"/>
+              </w:rPr>
+              <w:t xml:space="preserve">, lalu </w:t>
+            </w:r>
+            <w:r>
+              <w:rPr>
+                <w:rStyle w:val="HTMLCode"/>
+                <w:color w:val="1A1A1A"/>
+              </w:rPr>
+              <w:t>r</w:t>
+            </w:r>
+            <w:r>
+              <w:rPr>
+                <w:rFonts w:ascii="Calibri" w:eastAsia="Times New Roman" w:hAnsi="Calibri" w:cs="Calibri"/>
+                <w:color w:val="1A1A1A"/>
+                <w:sz w:val="22"/>
+                <w:szCs w:val="22"/>
+              </w:rPr>
+              <w:t xml:space="preserve"> ditekan: tema langsung berubah menjadi hijau tanpa memulai ulang aplikasi.</w:t>
             </w:r>
           </w:p>
         </w:tc>
@@ -2174,7 +2229,7 @@
           <w:lang w:val="id-ID"/>
         </w:rPr>
         <w:drawing>
-          <wp:inline distT="0" distB="0" distL="0" distR="0" wp14:anchorId="1541AA50" wp14:editId="7D33CD14">
+          <wp:inline distT="0" distB="0" distL="0" distR="0" wp14:anchorId="03F893BD" wp14:editId="2885CAF4">
             <wp:extent cx="5715000" cy="1981200"/>
             <wp:effectExtent l="0" t="0" r="0" b="0"/>
             <wp:docPr id="1" name="Picture 1" descr="flutter doctor"/>
@@ -2282,7 +2337,7 @@
           <w:lang w:val="id-ID"/>
         </w:rPr>
         <w:drawing>
-          <wp:inline distT="0" distB="0" distL="0" distR="0" wp14:anchorId="21046A61" wp14:editId="6FE52147">
+          <wp:inline distT="0" distB="0" distL="0" distR="0" wp14:anchorId="5EC0B2B2" wp14:editId="4AE6AD73">
             <wp:extent cx="1905000" cy="4121150"/>
             <wp:effectExtent l="0" t="0" r="0" b="0"/>
             <wp:docPr id="2" name="Picture 2" descr="Aplikasi Hello World"/>
@@ -2472,7 +2527,17 @@
           <w:szCs w:val="22"/>
           <w:lang w:val="id-ID"/>
         </w:rPr>
-        <w:t xml:space="preserve"> juga harus dinyalakan agar aplikasi bisa dipasang dari laptop. Kendala lain yang cukup lama adalah build APK pertama gagal karena NDK belum terpasang; setelah NDK 28.2 dipasang lewat SDK Manager, build berhasil.</w:t>
+        <w:t xml:space="preserve"> </w:t>
+      </w:r>
+      <w:r>
+        <w:rPr>
+          <w:rFonts w:ascii="Calibri" w:hAnsi="Calibri" w:cs="Calibri"/>
+          <w:color w:val="1A1A1A"/>
+          <w:sz w:val="22"/>
+          <w:szCs w:val="22"/>
+          <w:lang w:val="id-ID"/>
+        </w:rPr>
+        <w:t>juga harus dinyalakan agar aplikasi bisa dipasang dari laptop. Kendala lain yang cukup lama adalah build APK pertama gagal karena NDK belum terpasang; setelah NDK 28.2 dipasang lewat SDK Manager, build berhasil.</w:t>
       </w:r>
     </w:p>
     <w:p>
@@ -2552,7 +2617,133 @@
           <w:szCs w:val="22"/>
           <w:lang w:val="id-ID"/>
         </w:rPr>
-        <w:t>……………</w:t>
+        <w:t xml:space="preserve">Saya menekan tombol + sampai angka counter menjadi 5. Setelah warna tema diganti dari hijau ke oranye dan saya menekan </w:t>
+      </w:r>
+      <w:r>
+        <w:rPr>
+          <w:rStyle w:val="HTMLCode"/>
+          <w:color w:val="1A1A1A"/>
+          <w:lang w:val="id-ID"/>
+        </w:rPr>
+        <w:t>r</w:t>
+      </w:r>
+      <w:r>
+        <w:rPr>
+          <w:rFonts w:ascii="Calibri" w:hAnsi="Calibri" w:cs="Calibri"/>
+          <w:color w:val="1A1A1A"/>
+          <w:sz w:val="22"/>
+          <w:szCs w:val="22"/>
+          <w:lang w:val="id-ID"/>
+        </w:rPr>
+        <w:t xml:space="preserve"> </w:t>
+      </w:r>
+      <w:r>
+        <w:rPr>
+          <w:rFonts w:ascii="Calibri" w:hAnsi="Calibri" w:cs="Calibri"/>
+          <w:color w:val="1A1A1A"/>
+          <w:sz w:val="22"/>
+          <w:szCs w:val="22"/>
+          <w:lang w:val="id-ID"/>
+        </w:rPr>
+        <w:t xml:space="preserve">(hot reload), yang berubah hanya tampilannya menjadi oranye, sedangkan angka tetap 5. Artinya hot reload hanya menyuntikkan perubahan kode ke aplikasi yang sedang berjalan dan </w:t>
+      </w:r>
+      <w:r>
+        <w:rPr>
+          <w:rFonts w:ascii="Calibri" w:hAnsi="Calibri" w:cs="Calibri"/>
+          <w:b/>
+          <w:bCs/>
+          <w:color w:val="1A1A1A"/>
+          <w:sz w:val="22"/>
+          <w:szCs w:val="22"/>
+          <w:lang w:val="id-ID"/>
+        </w:rPr>
+        <w:t>state tetap dipertahankan</w:t>
+      </w:r>
+      <w:r>
+        <w:rPr>
+          <w:rFonts w:ascii="Calibri" w:hAnsi="Calibri" w:cs="Calibri"/>
+          <w:color w:val="1A1A1A"/>
+          <w:sz w:val="22"/>
+          <w:szCs w:val="22"/>
+          <w:lang w:val="id-ID"/>
+        </w:rPr>
+        <w:t xml:space="preserve">. Setelah saya menekan </w:t>
+      </w:r>
+      <w:r>
+        <w:rPr>
+          <w:rStyle w:val="HTMLCode"/>
+          <w:color w:val="1A1A1A"/>
+          <w:lang w:val="id-ID"/>
+        </w:rPr>
+        <w:t>R</w:t>
+      </w:r>
+      <w:r>
+        <w:rPr>
+          <w:rFonts w:ascii="Calibri" w:hAnsi="Calibri" w:cs="Calibri"/>
+          <w:color w:val="1A1A1A"/>
+          <w:sz w:val="22"/>
+          <w:szCs w:val="22"/>
+          <w:lang w:val="id-ID"/>
+        </w:rPr>
+        <w:t xml:space="preserve"> (hot restart), angka kembali menjadi 0 karena aplikasi dimulai ulang dari awal sehingga </w:t>
+      </w:r>
+      <w:r>
+        <w:rPr>
+          <w:rFonts w:ascii="Calibri" w:hAnsi="Calibri" w:cs="Calibri"/>
+          <w:b/>
+          <w:bCs/>
+          <w:color w:val="1A1A1A"/>
+          <w:sz w:val="22"/>
+          <w:szCs w:val="22"/>
+          <w:lang w:val="id-ID"/>
+        </w:rPr>
+        <w:t>state ikut di-reset</w:t>
+      </w:r>
+      <w:r>
+        <w:rPr>
+          <w:rFonts w:ascii="Calibri" w:hAnsi="Calibri" w:cs="Calibri"/>
+          <w:color w:val="1A1A1A"/>
+          <w:sz w:val="22"/>
+          <w:szCs w:val="22"/>
+          <w:lang w:val="id-ID"/>
+        </w:rPr>
+        <w:t xml:space="preserve">. Jadi hot reload cocok untuk mengubah tampilan sambil mempertahankan data yang sedang diuji, sedangkan hot restart dipakai bila perubahan ada di </w:t>
+      </w:r>
+      <w:r>
+        <w:rPr>
+          <w:rStyle w:val="HTMLCode"/>
+          <w:color w:val="1A1A1A"/>
+          <w:lang w:val="id-ID"/>
+        </w:rPr>
+        <w:t>main()</w:t>
+      </w:r>
+      <w:r>
+        <w:rPr>
+          <w:rFonts w:ascii="Calibri" w:hAnsi="Calibri" w:cs="Calibri"/>
+          <w:color w:val="1A1A1A"/>
+          <w:sz w:val="22"/>
+          <w:szCs w:val="22"/>
+          <w:lang w:val="id-ID"/>
+        </w:rPr>
+        <w:t xml:space="preserve">, </w:t>
+      </w:r>
+      <w:r>
+        <w:rPr>
+          <w:rStyle w:val="HTMLCode"/>
+          <w:color w:val="1A1A1A"/>
+          <w:lang w:val="id-ID"/>
+        </w:rPr>
+        <w:t>initState()</w:t>
+      </w:r>
+      <w:r>
+        <w:rPr>
+          <w:rFonts w:ascii="Calibri" w:hAnsi="Calibri" w:cs="Calibri"/>
+          <w:color w:val="1A1A1A"/>
+          <w:sz w:val="22"/>
+          <w:szCs w:val="22"/>
+          <w:lang w:val="id-ID"/>
+        </w:rPr>
+        <w:t>, atau variabel yang hanya diisi sekali di awal.</w:t>
       </w:r>
     </w:p>
     <w:p>

</xml_diff>

<commit_message>
Perbarui lembar kerja setelah ditinjau
</commit_message>
<xml_diff>
--- a/dokumen/Lembar_Kerja_Praktikum_P1_4243250002.docx
+++ b/dokumen/Lembar_Kerja_Praktikum_P1_4243250002.docx
@@ -5,6 +5,7 @@
     <w:p>
       <w:pPr>
         <w:pStyle w:val="Heading1"/>
+        <w:jc w:val="both"/>
         <w:rPr>
           <w:rFonts w:ascii="Calibri" w:eastAsia="Times New Roman" w:hAnsi="Calibri" w:cs="Calibri"/>
           <w:lang w:val="id-ID"/>
@@ -21,6 +22,7 @@
     <w:p>
       <w:pPr>
         <w:pStyle w:val="sub"/>
+        <w:jc w:val="both"/>
         <w:rPr>
           <w:rFonts w:ascii="Calibri" w:hAnsi="Calibri" w:cs="Calibri"/>
           <w:sz w:val="22"/>
@@ -75,6 +77,7 @@
           <w:p>
             <w:pPr>
               <w:spacing w:before="80" w:after="160"/>
+              <w:jc w:val="both"/>
               <w:rPr>
                 <w:rFonts w:ascii="Calibri" w:eastAsia="Times New Roman" w:hAnsi="Calibri" w:cs="Calibri"/>
                 <w:b/>
@@ -117,6 +120,7 @@
           <w:p>
             <w:pPr>
               <w:spacing w:before="80" w:after="160"/>
+              <w:jc w:val="both"/>
               <w:rPr>
                 <w:rFonts w:ascii="Calibri" w:eastAsia="Times New Roman" w:hAnsi="Calibri" w:cs="Calibri"/>
                 <w:color w:val="1A1A1A"/>
@@ -131,7 +135,27 @@
                 <w:sz w:val="22"/>
                 <w:szCs w:val="22"/>
               </w:rPr>
-              <w:t>Muhammad Tsabat Muhyiyuddin</w:t>
+              <w:t xml:space="preserve">Muhammad </w:t>
+            </w:r>
+            <w:proofErr w:type="spellStart"/>
+            <w:r>
+              <w:rPr>
+                <w:rFonts w:ascii="Calibri" w:eastAsia="Times New Roman" w:hAnsi="Calibri" w:cs="Calibri"/>
+                <w:color w:val="1A1A1A"/>
+                <w:sz w:val="22"/>
+                <w:szCs w:val="22"/>
+              </w:rPr>
+              <w:t>Tsabat</w:t>
+            </w:r>
+            <w:proofErr w:type="spellEnd"/>
+            <w:r>
+              <w:rPr>
+                <w:rFonts w:ascii="Calibri" w:eastAsia="Times New Roman" w:hAnsi="Calibri" w:cs="Calibri"/>
+                <w:color w:val="1A1A1A"/>
+                <w:sz w:val="22"/>
+                <w:szCs w:val="22"/>
+              </w:rPr>
+              <w:t xml:space="preserve"> Muhyiyuddin</w:t>
             </w:r>
           </w:p>
         </w:tc>
@@ -158,6 +182,7 @@
           <w:p>
             <w:pPr>
               <w:spacing w:before="80" w:after="160"/>
+              <w:jc w:val="both"/>
               <w:rPr>
                 <w:rFonts w:ascii="Calibri" w:eastAsia="Times New Roman" w:hAnsi="Calibri" w:cs="Calibri"/>
                 <w:b/>
@@ -200,6 +225,7 @@
           <w:p>
             <w:pPr>
               <w:spacing w:before="80" w:after="160"/>
+              <w:jc w:val="both"/>
               <w:rPr>
                 <w:rFonts w:ascii="Calibri" w:eastAsia="Times New Roman" w:hAnsi="Calibri" w:cs="Calibri"/>
                 <w:color w:val="1A1A1A"/>
@@ -241,6 +267,7 @@
           <w:p>
             <w:pPr>
               <w:spacing w:before="80" w:after="160"/>
+              <w:jc w:val="both"/>
               <w:rPr>
                 <w:rFonts w:ascii="Calibri" w:eastAsia="Times New Roman" w:hAnsi="Calibri" w:cs="Calibri"/>
                 <w:b/>
@@ -250,6 +277,7 @@
                 <w:szCs w:val="22"/>
               </w:rPr>
             </w:pPr>
+            <w:proofErr w:type="spellStart"/>
             <w:r>
               <w:rPr>
                 <w:rFonts w:ascii="Calibri" w:eastAsia="Times New Roman" w:hAnsi="Calibri" w:cs="Calibri"/>
@@ -261,6 +289,7 @@
               </w:rPr>
               <w:t>Kelas</w:t>
             </w:r>
+            <w:proofErr w:type="spellEnd"/>
           </w:p>
         </w:tc>
         <w:tc>
@@ -283,6 +312,7 @@
           <w:p>
             <w:pPr>
               <w:spacing w:before="80" w:after="160"/>
+              <w:jc w:val="both"/>
               <w:rPr>
                 <w:rFonts w:ascii="Calibri" w:eastAsia="Times New Roman" w:hAnsi="Calibri" w:cs="Calibri"/>
                 <w:color w:val="1A1A1A"/>
@@ -324,6 +354,7 @@
           <w:p>
             <w:pPr>
               <w:spacing w:before="80" w:after="160"/>
+              <w:jc w:val="both"/>
               <w:rPr>
                 <w:rFonts w:ascii="Calibri" w:eastAsia="Times New Roman" w:hAnsi="Calibri" w:cs="Calibri"/>
                 <w:b/>
@@ -342,7 +373,31 @@
                 <w:sz w:val="22"/>
                 <w:szCs w:val="22"/>
               </w:rPr>
-              <w:t>Repository Tugas Rutin 1</w:t>
+              <w:t xml:space="preserve">Repository </w:t>
+            </w:r>
+            <w:proofErr w:type="spellStart"/>
+            <w:r>
+              <w:rPr>
+                <w:rFonts w:ascii="Calibri" w:eastAsia="Times New Roman" w:hAnsi="Calibri" w:cs="Calibri"/>
+                <w:b/>
+                <w:bCs/>
+                <w:color w:val="1A1A1A"/>
+                <w:sz w:val="22"/>
+                <w:szCs w:val="22"/>
+              </w:rPr>
+              <w:t>Tugas</w:t>
+            </w:r>
+            <w:proofErr w:type="spellEnd"/>
+            <w:r>
+              <w:rPr>
+                <w:rFonts w:ascii="Calibri" w:eastAsia="Times New Roman" w:hAnsi="Calibri" w:cs="Calibri"/>
+                <w:b/>
+                <w:bCs/>
+                <w:color w:val="1A1A1A"/>
+                <w:sz w:val="22"/>
+                <w:szCs w:val="22"/>
+              </w:rPr>
+              <w:t xml:space="preserve"> Rutin 1</w:t>
             </w:r>
           </w:p>
         </w:tc>
@@ -366,6 +421,7 @@
           <w:p>
             <w:pPr>
               <w:spacing w:before="80" w:after="160"/>
+              <w:jc w:val="both"/>
               <w:rPr>
                 <w:rFonts w:ascii="Calibri" w:eastAsia="Times New Roman" w:hAnsi="Calibri" w:cs="Calibri"/>
                 <w:color w:val="1A1A1A"/>
@@ -389,6 +445,7 @@
     <w:p>
       <w:pPr>
         <w:pStyle w:val="Heading2"/>
+        <w:jc w:val="both"/>
         <w:rPr>
           <w:rFonts w:ascii="Calibri" w:eastAsia="Times New Roman" w:hAnsi="Calibri" w:cs="Calibri"/>
           <w:lang w:val="id-ID"/>
@@ -441,6 +498,7 @@
           <w:p>
             <w:pPr>
               <w:spacing w:before="80" w:after="160"/>
+              <w:jc w:val="both"/>
               <w:rPr>
                 <w:rFonts w:ascii="Calibri" w:eastAsia="Times New Roman" w:hAnsi="Calibri" w:cs="Calibri"/>
                 <w:b/>
@@ -485,6 +543,7 @@
           <w:p>
             <w:pPr>
               <w:spacing w:before="80" w:after="160"/>
+              <w:jc w:val="both"/>
               <w:rPr>
                 <w:rFonts w:ascii="Calibri" w:eastAsia="Times New Roman" w:hAnsi="Calibri" w:cs="Calibri"/>
                 <w:b/>
@@ -529,6 +588,7 @@
           <w:p>
             <w:pPr>
               <w:spacing w:before="80" w:after="160"/>
+              <w:jc w:val="both"/>
               <w:rPr>
                 <w:rFonts w:ascii="Calibri" w:eastAsia="Times New Roman" w:hAnsi="Calibri" w:cs="Calibri"/>
                 <w:b/>
@@ -547,8 +607,21 @@
                 <w:sz w:val="22"/>
                 <w:szCs w:val="22"/>
               </w:rPr>
-              <w:t>Bukti / Catatan</w:t>
-            </w:r>
+              <w:t xml:space="preserve">Bukti / </w:t>
+            </w:r>
+            <w:proofErr w:type="spellStart"/>
+            <w:r>
+              <w:rPr>
+                <w:rFonts w:ascii="Calibri" w:eastAsia="Times New Roman" w:hAnsi="Calibri" w:cs="Calibri"/>
+                <w:b/>
+                <w:bCs/>
+                <w:color w:val="FFFFFF"/>
+                <w:sz w:val="22"/>
+                <w:szCs w:val="22"/>
+              </w:rPr>
+              <w:t>Catatan</w:t>
+            </w:r>
+            <w:proofErr w:type="spellEnd"/>
           </w:p>
         </w:tc>
       </w:tr>
@@ -573,7 +646,7 @@
           <w:p>
             <w:pPr>
               <w:spacing w:before="80" w:after="160"/>
-              <w:jc w:val="center"/>
+              <w:jc w:val="both"/>
               <w:rPr>
                 <w:rFonts w:ascii="Calibri" w:eastAsia="Times New Roman" w:hAnsi="Calibri" w:cs="Calibri"/>
                 <w:b/>
@@ -616,6 +689,7 @@
           <w:p>
             <w:pPr>
               <w:spacing w:before="80" w:after="160"/>
+              <w:jc w:val="both"/>
               <w:rPr>
                 <w:rFonts w:ascii="Calibri" w:eastAsia="Times New Roman" w:hAnsi="Calibri" w:cs="Calibri"/>
                 <w:color w:val="1A1A1A"/>
@@ -637,7 +711,47 @@
                 <w:sz w:val="22"/>
                 <w:szCs w:val="22"/>
               </w:rPr>
-              <w:t xml:space="preserve"> menampilkan versi Git</w:t>
+              <w:t xml:space="preserve"> </w:t>
+            </w:r>
+            <w:proofErr w:type="spellStart"/>
+            <w:r>
+              <w:rPr>
+                <w:rFonts w:ascii="Calibri" w:eastAsia="Times New Roman" w:hAnsi="Calibri" w:cs="Calibri"/>
+                <w:color w:val="1A1A1A"/>
+                <w:sz w:val="22"/>
+                <w:szCs w:val="22"/>
+              </w:rPr>
+              <w:t>menampilkan</w:t>
+            </w:r>
+            <w:proofErr w:type="spellEnd"/>
+            <w:r>
+              <w:rPr>
+                <w:rFonts w:ascii="Calibri" w:eastAsia="Times New Roman" w:hAnsi="Calibri" w:cs="Calibri"/>
+                <w:color w:val="1A1A1A"/>
+                <w:sz w:val="22"/>
+                <w:szCs w:val="22"/>
+              </w:rPr>
+              <w:t xml:space="preserve"> </w:t>
+            </w:r>
+            <w:proofErr w:type="spellStart"/>
+            <w:r>
+              <w:rPr>
+                <w:rFonts w:ascii="Calibri" w:eastAsia="Times New Roman" w:hAnsi="Calibri" w:cs="Calibri"/>
+                <w:color w:val="1A1A1A"/>
+                <w:sz w:val="22"/>
+                <w:szCs w:val="22"/>
+              </w:rPr>
+              <w:t>versi</w:t>
+            </w:r>
+            <w:proofErr w:type="spellEnd"/>
+            <w:r>
+              <w:rPr>
+                <w:rFonts w:ascii="Calibri" w:eastAsia="Times New Roman" w:hAnsi="Calibri" w:cs="Calibri"/>
+                <w:color w:val="1A1A1A"/>
+                <w:sz w:val="22"/>
+                <w:szCs w:val="22"/>
+              </w:rPr>
+              <w:t xml:space="preserve"> Git</w:t>
             </w:r>
           </w:p>
         </w:tc>
@@ -661,6 +775,7 @@
           <w:p>
             <w:pPr>
               <w:spacing w:before="80" w:after="160"/>
+              <w:jc w:val="both"/>
               <w:rPr>
                 <w:rFonts w:ascii="Calibri" w:eastAsia="Times New Roman" w:hAnsi="Calibri" w:cs="Calibri"/>
                 <w:color w:val="1A1A1A"/>
@@ -675,7 +790,27 @@
                 <w:sz w:val="22"/>
                 <w:szCs w:val="22"/>
               </w:rPr>
-              <w:t>git version 2.56.0.windows.2</w:t>
+              <w:t>git version 2.56.</w:t>
+            </w:r>
+            <w:proofErr w:type="gramStart"/>
+            <w:r>
+              <w:rPr>
+                <w:rFonts w:ascii="Calibri" w:eastAsia="Times New Roman" w:hAnsi="Calibri" w:cs="Calibri"/>
+                <w:color w:val="1A1A1A"/>
+                <w:sz w:val="22"/>
+                <w:szCs w:val="22"/>
+              </w:rPr>
+              <w:t>0.windows</w:t>
+            </w:r>
+            <w:proofErr w:type="gramEnd"/>
+            <w:r>
+              <w:rPr>
+                <w:rFonts w:ascii="Calibri" w:eastAsia="Times New Roman" w:hAnsi="Calibri" w:cs="Calibri"/>
+                <w:color w:val="1A1A1A"/>
+                <w:sz w:val="22"/>
+                <w:szCs w:val="22"/>
+              </w:rPr>
+              <w:t>.2</w:t>
             </w:r>
           </w:p>
         </w:tc>
@@ -701,7 +836,7 @@
           <w:p>
             <w:pPr>
               <w:spacing w:before="80" w:after="160"/>
-              <w:jc w:val="center"/>
+              <w:jc w:val="both"/>
               <w:rPr>
                 <w:rFonts w:ascii="Calibri" w:eastAsia="Times New Roman" w:hAnsi="Calibri" w:cs="Calibri"/>
                 <w:b/>
@@ -744,6 +879,7 @@
           <w:p>
             <w:pPr>
               <w:spacing w:before="80" w:after="160"/>
+              <w:jc w:val="both"/>
               <w:rPr>
                 <w:rFonts w:ascii="Calibri" w:eastAsia="Times New Roman" w:hAnsi="Calibri" w:cs="Calibri"/>
                 <w:color w:val="1A1A1A"/>
@@ -751,14 +887,45 @@
                 <w:szCs w:val="22"/>
               </w:rPr>
             </w:pPr>
-            <w:r>
-              <w:rPr>
-                <w:rFonts w:ascii="Calibri" w:eastAsia="Times New Roman" w:hAnsi="Calibri" w:cs="Calibri"/>
-                <w:color w:val="1A1A1A"/>
-                <w:sz w:val="22"/>
-                <w:szCs w:val="22"/>
-              </w:rPr>
-              <w:t>Ekstensi Flutter terpasang di VS Code</w:t>
+            <w:proofErr w:type="spellStart"/>
+            <w:r>
+              <w:rPr>
+                <w:rFonts w:ascii="Calibri" w:eastAsia="Times New Roman" w:hAnsi="Calibri" w:cs="Calibri"/>
+                <w:color w:val="1A1A1A"/>
+                <w:sz w:val="22"/>
+                <w:szCs w:val="22"/>
+              </w:rPr>
+              <w:t>Ekstensi</w:t>
+            </w:r>
+            <w:proofErr w:type="spellEnd"/>
+            <w:r>
+              <w:rPr>
+                <w:rFonts w:ascii="Calibri" w:eastAsia="Times New Roman" w:hAnsi="Calibri" w:cs="Calibri"/>
+                <w:color w:val="1A1A1A"/>
+                <w:sz w:val="22"/>
+                <w:szCs w:val="22"/>
+              </w:rPr>
+              <w:t xml:space="preserve"> Flutter </w:t>
+            </w:r>
+            <w:proofErr w:type="spellStart"/>
+            <w:r>
+              <w:rPr>
+                <w:rFonts w:ascii="Calibri" w:eastAsia="Times New Roman" w:hAnsi="Calibri" w:cs="Calibri"/>
+                <w:color w:val="1A1A1A"/>
+                <w:sz w:val="22"/>
+                <w:szCs w:val="22"/>
+              </w:rPr>
+              <w:t>terpasang</w:t>
+            </w:r>
+            <w:proofErr w:type="spellEnd"/>
+            <w:r>
+              <w:rPr>
+                <w:rFonts w:ascii="Calibri" w:eastAsia="Times New Roman" w:hAnsi="Calibri" w:cs="Calibri"/>
+                <w:color w:val="1A1A1A"/>
+                <w:sz w:val="22"/>
+                <w:szCs w:val="22"/>
+              </w:rPr>
+              <w:t xml:space="preserve"> di VS Code</w:t>
             </w:r>
           </w:p>
         </w:tc>
@@ -782,6 +949,7 @@
           <w:p>
             <w:pPr>
               <w:spacing w:before="80" w:after="160"/>
+              <w:jc w:val="both"/>
               <w:rPr>
                 <w:rFonts w:ascii="Calibri" w:eastAsia="Times New Roman" w:hAnsi="Calibri" w:cs="Calibri"/>
                 <w:color w:val="1A1A1A"/>
@@ -794,8 +962,19 @@
                 <w:rStyle w:val="HTMLCode"/>
                 <w:color w:val="1A1A1A"/>
               </w:rPr>
-              <w:t>dart-code.flutter</w:t>
-            </w:r>
+              <w:t>dart-</w:t>
+            </w:r>
+            <w:proofErr w:type="spellStart"/>
+            <w:proofErr w:type="gramStart"/>
+            <w:r>
+              <w:rPr>
+                <w:rStyle w:val="HTMLCode"/>
+                <w:color w:val="1A1A1A"/>
+              </w:rPr>
+              <w:t>code.flutter</w:t>
+            </w:r>
+            <w:proofErr w:type="spellEnd"/>
+            <w:proofErr w:type="gramEnd"/>
             <w:r>
               <w:rPr>
                 <w:rFonts w:ascii="Calibri" w:eastAsia="Times New Roman" w:hAnsi="Calibri" w:cs="Calibri"/>
@@ -810,7 +989,25 @@
                 <w:rStyle w:val="HTMLCode"/>
                 <w:color w:val="1A1A1A"/>
               </w:rPr>
-              <w:t>dart-code.dart-code</w:t>
+              <w:t>dart-</w:t>
+            </w:r>
+            <w:proofErr w:type="spellStart"/>
+            <w:proofErr w:type="gramStart"/>
+            <w:r>
+              <w:rPr>
+                <w:rStyle w:val="HTMLCode"/>
+                <w:color w:val="1A1A1A"/>
+              </w:rPr>
+              <w:t>code.dart</w:t>
+            </w:r>
+            <w:proofErr w:type="spellEnd"/>
+            <w:proofErr w:type="gramEnd"/>
+            <w:r>
+              <w:rPr>
+                <w:rStyle w:val="HTMLCode"/>
+                <w:color w:val="1A1A1A"/>
+              </w:rPr>
+              <w:t>-code</w:t>
             </w:r>
           </w:p>
         </w:tc>
@@ -836,7 +1033,7 @@
           <w:p>
             <w:pPr>
               <w:spacing w:before="80" w:after="160"/>
-              <w:jc w:val="center"/>
+              <w:jc w:val="both"/>
               <w:rPr>
                 <w:rFonts w:ascii="Calibri" w:eastAsia="Times New Roman" w:hAnsi="Calibri" w:cs="Calibri"/>
                 <w:b/>
@@ -879,6 +1076,7 @@
           <w:p>
             <w:pPr>
               <w:spacing w:before="80" w:after="160"/>
+              <w:jc w:val="both"/>
               <w:rPr>
                 <w:rFonts w:ascii="Calibri" w:eastAsia="Times New Roman" w:hAnsi="Calibri" w:cs="Calibri"/>
                 <w:color w:val="1A1A1A"/>
@@ -902,14 +1100,25 @@
               </w:rPr>
               <w:t xml:space="preserve"> </w:t>
             </w:r>
-            <w:r>
-              <w:rPr>
-                <w:rFonts w:ascii="Calibri" w:eastAsia="Times New Roman" w:hAnsi="Calibri" w:cs="Calibri"/>
-                <w:color w:val="1A1A1A"/>
-                <w:sz w:val="22"/>
-                <w:szCs w:val="22"/>
-              </w:rPr>
-              <w:t>menampilkan Flutter 3.47.x dan Dart 3.13.x</w:t>
+            <w:proofErr w:type="spellStart"/>
+            <w:r>
+              <w:rPr>
+                <w:rFonts w:ascii="Calibri" w:eastAsia="Times New Roman" w:hAnsi="Calibri" w:cs="Calibri"/>
+                <w:color w:val="1A1A1A"/>
+                <w:sz w:val="22"/>
+                <w:szCs w:val="22"/>
+              </w:rPr>
+              <w:t>menampilkan</w:t>
+            </w:r>
+            <w:proofErr w:type="spellEnd"/>
+            <w:r>
+              <w:rPr>
+                <w:rFonts w:ascii="Calibri" w:eastAsia="Times New Roman" w:hAnsi="Calibri" w:cs="Calibri"/>
+                <w:color w:val="1A1A1A"/>
+                <w:sz w:val="22"/>
+                <w:szCs w:val="22"/>
+              </w:rPr>
+              <w:t xml:space="preserve"> Flutter 3.47.x dan Dart 3.13.x</w:t>
             </w:r>
           </w:p>
         </w:tc>
@@ -933,6 +1142,7 @@
           <w:p>
             <w:pPr>
               <w:spacing w:before="80" w:after="160"/>
+              <w:jc w:val="both"/>
               <w:rPr>
                 <w:rFonts w:ascii="Calibri" w:eastAsia="Times New Roman" w:hAnsi="Calibri" w:cs="Calibri"/>
                 <w:color w:val="1A1A1A"/>
@@ -940,14 +1150,45 @@
                 <w:szCs w:val="22"/>
               </w:rPr>
             </w:pPr>
-            <w:r>
-              <w:rPr>
-                <w:rFonts w:ascii="Calibri" w:eastAsia="Times New Roman" w:hAnsi="Calibri" w:cs="Calibri"/>
-                <w:color w:val="1A1A1A"/>
-                <w:sz w:val="22"/>
-                <w:szCs w:val="22"/>
-              </w:rPr>
-              <w:t>Versi: Flutter 3.47.7 (stable), Dart 3.13.5, DevTools 2.60.0</w:t>
+            <w:proofErr w:type="spellStart"/>
+            <w:r>
+              <w:rPr>
+                <w:rFonts w:ascii="Calibri" w:eastAsia="Times New Roman" w:hAnsi="Calibri" w:cs="Calibri"/>
+                <w:color w:val="1A1A1A"/>
+                <w:sz w:val="22"/>
+                <w:szCs w:val="22"/>
+              </w:rPr>
+              <w:t>Versi</w:t>
+            </w:r>
+            <w:proofErr w:type="spellEnd"/>
+            <w:r>
+              <w:rPr>
+                <w:rFonts w:ascii="Calibri" w:eastAsia="Times New Roman" w:hAnsi="Calibri" w:cs="Calibri"/>
+                <w:color w:val="1A1A1A"/>
+                <w:sz w:val="22"/>
+                <w:szCs w:val="22"/>
+              </w:rPr>
+              <w:t xml:space="preserve">: Flutter 3.47.7 (stable), Dart 3.13.5, </w:t>
+            </w:r>
+            <w:proofErr w:type="spellStart"/>
+            <w:r>
+              <w:rPr>
+                <w:rFonts w:ascii="Calibri" w:eastAsia="Times New Roman" w:hAnsi="Calibri" w:cs="Calibri"/>
+                <w:color w:val="1A1A1A"/>
+                <w:sz w:val="22"/>
+                <w:szCs w:val="22"/>
+              </w:rPr>
+              <w:t>DevTools</w:t>
+            </w:r>
+            <w:proofErr w:type="spellEnd"/>
+            <w:r>
+              <w:rPr>
+                <w:rFonts w:ascii="Calibri" w:eastAsia="Times New Roman" w:hAnsi="Calibri" w:cs="Calibri"/>
+                <w:color w:val="1A1A1A"/>
+                <w:sz w:val="22"/>
+                <w:szCs w:val="22"/>
+              </w:rPr>
+              <w:t xml:space="preserve"> 2.60.0</w:t>
             </w:r>
           </w:p>
         </w:tc>
@@ -973,7 +1214,7 @@
           <w:p>
             <w:pPr>
               <w:spacing w:before="80" w:after="160"/>
-              <w:jc w:val="center"/>
+              <w:jc w:val="both"/>
               <w:rPr>
                 <w:rFonts w:ascii="Calibri" w:eastAsia="Times New Roman" w:hAnsi="Calibri" w:cs="Calibri"/>
                 <w:b/>
@@ -1016,6 +1257,7 @@
           <w:p>
             <w:pPr>
               <w:spacing w:before="80" w:after="160"/>
+              <w:jc w:val="both"/>
               <w:rPr>
                 <w:rFonts w:ascii="Calibri" w:eastAsia="Times New Roman" w:hAnsi="Calibri" w:cs="Calibri"/>
                 <w:color w:val="1A1A1A"/>
@@ -1030,8 +1272,19 @@
                 <w:sz w:val="22"/>
                 <w:szCs w:val="22"/>
               </w:rPr>
-              <w:t>Android SDK, Command-line Tools, dan Emulator terpasang</w:t>
-            </w:r>
+              <w:t xml:space="preserve">Android SDK, Command-line Tools, dan Emulator </w:t>
+            </w:r>
+            <w:proofErr w:type="spellStart"/>
+            <w:r>
+              <w:rPr>
+                <w:rFonts w:ascii="Calibri" w:eastAsia="Times New Roman" w:hAnsi="Calibri" w:cs="Calibri"/>
+                <w:color w:val="1A1A1A"/>
+                <w:sz w:val="22"/>
+                <w:szCs w:val="22"/>
+              </w:rPr>
+              <w:t>terpasang</w:t>
+            </w:r>
+            <w:proofErr w:type="spellEnd"/>
           </w:p>
         </w:tc>
         <w:tc>
@@ -1054,6 +1307,7 @@
           <w:p>
             <w:pPr>
               <w:spacing w:before="80" w:after="160"/>
+              <w:jc w:val="both"/>
               <w:rPr>
                 <w:rFonts w:ascii="Calibri" w:eastAsia="Times New Roman" w:hAnsi="Calibri" w:cs="Calibri"/>
                 <w:color w:val="1A1A1A"/>
@@ -1094,7 +1348,7 @@
           <w:p>
             <w:pPr>
               <w:spacing w:before="80" w:after="160"/>
-              <w:jc w:val="center"/>
+              <w:jc w:val="both"/>
               <w:rPr>
                 <w:rFonts w:ascii="Calibri" w:eastAsia="Times New Roman" w:hAnsi="Calibri" w:cs="Calibri"/>
                 <w:b/>
@@ -1137,6 +1391,7 @@
           <w:p>
             <w:pPr>
               <w:spacing w:before="80" w:after="160"/>
+              <w:jc w:val="both"/>
               <w:rPr>
                 <w:rFonts w:ascii="Calibri" w:eastAsia="Times New Roman" w:hAnsi="Calibri" w:cs="Calibri"/>
                 <w:color w:val="1A1A1A"/>
@@ -1144,14 +1399,45 @@
                 <w:szCs w:val="22"/>
               </w:rPr>
             </w:pPr>
-            <w:r>
-              <w:rPr>
-                <w:rFonts w:ascii="Calibri" w:eastAsia="Times New Roman" w:hAnsi="Calibri" w:cs="Calibri"/>
-                <w:color w:val="1A1A1A"/>
-                <w:sz w:val="22"/>
-                <w:szCs w:val="22"/>
-              </w:rPr>
-              <w:t>Lisensi Android disetujui (</w:t>
+            <w:proofErr w:type="spellStart"/>
+            <w:r>
+              <w:rPr>
+                <w:rFonts w:ascii="Calibri" w:eastAsia="Times New Roman" w:hAnsi="Calibri" w:cs="Calibri"/>
+                <w:color w:val="1A1A1A"/>
+                <w:sz w:val="22"/>
+                <w:szCs w:val="22"/>
+              </w:rPr>
+              <w:t>Lisensi</w:t>
+            </w:r>
+            <w:proofErr w:type="spellEnd"/>
+            <w:r>
+              <w:rPr>
+                <w:rFonts w:ascii="Calibri" w:eastAsia="Times New Roman" w:hAnsi="Calibri" w:cs="Calibri"/>
+                <w:color w:val="1A1A1A"/>
+                <w:sz w:val="22"/>
+                <w:szCs w:val="22"/>
+              </w:rPr>
+              <w:t xml:space="preserve"> Android </w:t>
+            </w:r>
+            <w:proofErr w:type="spellStart"/>
+            <w:r>
+              <w:rPr>
+                <w:rFonts w:ascii="Calibri" w:eastAsia="Times New Roman" w:hAnsi="Calibri" w:cs="Calibri"/>
+                <w:color w:val="1A1A1A"/>
+                <w:sz w:val="22"/>
+                <w:szCs w:val="22"/>
+              </w:rPr>
+              <w:t>disetujui</w:t>
+            </w:r>
+            <w:proofErr w:type="spellEnd"/>
+            <w:r>
+              <w:rPr>
+                <w:rFonts w:ascii="Calibri" w:eastAsia="Times New Roman" w:hAnsi="Calibri" w:cs="Calibri"/>
+                <w:color w:val="1A1A1A"/>
+                <w:sz w:val="22"/>
+                <w:szCs w:val="22"/>
+              </w:rPr>
+              <w:t xml:space="preserve"> (</w:t>
             </w:r>
             <w:r>
               <w:rPr>
@@ -1191,6 +1477,7 @@
           <w:p>
             <w:pPr>
               <w:spacing w:before="80" w:after="160"/>
+              <w:jc w:val="both"/>
               <w:rPr>
                 <w:rFonts w:ascii="Calibri" w:eastAsia="Times New Roman" w:hAnsi="Calibri" w:cs="Calibri"/>
                 <w:color w:val="1A1A1A"/>
@@ -1198,15 +1485,57 @@
                 <w:szCs w:val="22"/>
               </w:rPr>
             </w:pPr>
-            <w:r>
-              <w:rPr>
-                <w:rFonts w:ascii="Calibri" w:eastAsia="Times New Roman" w:hAnsi="Calibri" w:cs="Calibri"/>
-                <w:color w:val="1A1A1A"/>
-                <w:sz w:val="22"/>
-                <w:szCs w:val="22"/>
-              </w:rPr>
-              <w:t>Semua lisensi disetujui</w:t>
-            </w:r>
+            <w:proofErr w:type="spellStart"/>
+            <w:r>
+              <w:rPr>
+                <w:rFonts w:ascii="Calibri" w:eastAsia="Times New Roman" w:hAnsi="Calibri" w:cs="Calibri"/>
+                <w:color w:val="1A1A1A"/>
+                <w:sz w:val="22"/>
+                <w:szCs w:val="22"/>
+              </w:rPr>
+              <w:t>Semua</w:t>
+            </w:r>
+            <w:proofErr w:type="spellEnd"/>
+            <w:r>
+              <w:rPr>
+                <w:rFonts w:ascii="Calibri" w:eastAsia="Times New Roman" w:hAnsi="Calibri" w:cs="Calibri"/>
+                <w:color w:val="1A1A1A"/>
+                <w:sz w:val="22"/>
+                <w:szCs w:val="22"/>
+              </w:rPr>
+              <w:t xml:space="preserve"> </w:t>
+            </w:r>
+            <w:proofErr w:type="spellStart"/>
+            <w:r>
+              <w:rPr>
+                <w:rFonts w:ascii="Calibri" w:eastAsia="Times New Roman" w:hAnsi="Calibri" w:cs="Calibri"/>
+                <w:color w:val="1A1A1A"/>
+                <w:sz w:val="22"/>
+                <w:szCs w:val="22"/>
+              </w:rPr>
+              <w:t>lisensi</w:t>
+            </w:r>
+            <w:proofErr w:type="spellEnd"/>
+            <w:r>
+              <w:rPr>
+                <w:rFonts w:ascii="Calibri" w:eastAsia="Times New Roman" w:hAnsi="Calibri" w:cs="Calibri"/>
+                <w:color w:val="1A1A1A"/>
+                <w:sz w:val="22"/>
+                <w:szCs w:val="22"/>
+              </w:rPr>
+              <w:t xml:space="preserve"> </w:t>
+            </w:r>
+            <w:proofErr w:type="spellStart"/>
+            <w:r>
+              <w:rPr>
+                <w:rFonts w:ascii="Calibri" w:eastAsia="Times New Roman" w:hAnsi="Calibri" w:cs="Calibri"/>
+                <w:color w:val="1A1A1A"/>
+                <w:sz w:val="22"/>
+                <w:szCs w:val="22"/>
+              </w:rPr>
+              <w:t>disetujui</w:t>
+            </w:r>
+            <w:proofErr w:type="spellEnd"/>
           </w:p>
         </w:tc>
       </w:tr>
@@ -1231,7 +1560,7 @@
           <w:p>
             <w:pPr>
               <w:spacing w:before="80" w:after="160"/>
-              <w:jc w:val="center"/>
+              <w:jc w:val="both"/>
               <w:rPr>
                 <w:rFonts w:ascii="Calibri" w:eastAsia="Times New Roman" w:hAnsi="Calibri" w:cs="Calibri"/>
                 <w:b/>
@@ -1274,6 +1603,7 @@
           <w:p>
             <w:pPr>
               <w:spacing w:before="80" w:after="160"/>
+              <w:jc w:val="both"/>
               <w:rPr>
                 <w:rFonts w:ascii="Calibri" w:eastAsia="Times New Roman" w:hAnsi="Calibri" w:cs="Calibri"/>
                 <w:color w:val="1A1A1A"/>
@@ -1295,7 +1625,27 @@
                 <w:sz w:val="22"/>
                 <w:szCs w:val="22"/>
               </w:rPr>
-              <w:t>: Flutter, Android toolchain, dan Connected device bertanda [</w:t>
+              <w:t xml:space="preserve">: Flutter, Android toolchain, dan Connected device </w:t>
+            </w:r>
+            <w:proofErr w:type="spellStart"/>
+            <w:r>
+              <w:rPr>
+                <w:rFonts w:ascii="Calibri" w:eastAsia="Times New Roman" w:hAnsi="Calibri" w:cs="Calibri"/>
+                <w:color w:val="1A1A1A"/>
+                <w:sz w:val="22"/>
+                <w:szCs w:val="22"/>
+              </w:rPr>
+              <w:t>bertanda</w:t>
+            </w:r>
+            <w:proofErr w:type="spellEnd"/>
+            <w:r>
+              <w:rPr>
+                <w:rFonts w:ascii="Calibri" w:eastAsia="Times New Roman" w:hAnsi="Calibri" w:cs="Calibri"/>
+                <w:color w:val="1A1A1A"/>
+                <w:sz w:val="22"/>
+                <w:szCs w:val="22"/>
+              </w:rPr>
+              <w:t xml:space="preserve"> [</w:t>
             </w:r>
             <w:r>
               <w:rPr>
@@ -1337,6 +1687,7 @@
           <w:p>
             <w:pPr>
               <w:spacing w:before="80" w:after="160"/>
+              <w:jc w:val="both"/>
               <w:rPr>
                 <w:rFonts w:ascii="Calibri" w:eastAsia="Times New Roman" w:hAnsi="Calibri" w:cs="Calibri"/>
                 <w:color w:val="1A1A1A"/>
@@ -1344,14 +1695,45 @@
                 <w:szCs w:val="22"/>
               </w:rPr>
             </w:pPr>
-            <w:r>
-              <w:rPr>
-                <w:rFonts w:ascii="Calibri" w:eastAsia="Times New Roman" w:hAnsi="Calibri" w:cs="Calibri"/>
-                <w:color w:val="1A1A1A"/>
-                <w:sz w:val="22"/>
-                <w:szCs w:val="22"/>
-              </w:rPr>
-              <w:t>Tangkapan layar: Gambar 1</w:t>
+            <w:proofErr w:type="spellStart"/>
+            <w:r>
+              <w:rPr>
+                <w:rFonts w:ascii="Calibri" w:eastAsia="Times New Roman" w:hAnsi="Calibri" w:cs="Calibri"/>
+                <w:color w:val="1A1A1A"/>
+                <w:sz w:val="22"/>
+                <w:szCs w:val="22"/>
+              </w:rPr>
+              <w:t>Tangkapan</w:t>
+            </w:r>
+            <w:proofErr w:type="spellEnd"/>
+            <w:r>
+              <w:rPr>
+                <w:rFonts w:ascii="Calibri" w:eastAsia="Times New Roman" w:hAnsi="Calibri" w:cs="Calibri"/>
+                <w:color w:val="1A1A1A"/>
+                <w:sz w:val="22"/>
+                <w:szCs w:val="22"/>
+              </w:rPr>
+              <w:t xml:space="preserve"> </w:t>
+            </w:r>
+            <w:proofErr w:type="spellStart"/>
+            <w:r>
+              <w:rPr>
+                <w:rFonts w:ascii="Calibri" w:eastAsia="Times New Roman" w:hAnsi="Calibri" w:cs="Calibri"/>
+                <w:color w:val="1A1A1A"/>
+                <w:sz w:val="22"/>
+                <w:szCs w:val="22"/>
+              </w:rPr>
+              <w:t>layar</w:t>
+            </w:r>
+            <w:proofErr w:type="spellEnd"/>
+            <w:r>
+              <w:rPr>
+                <w:rFonts w:ascii="Calibri" w:eastAsia="Times New Roman" w:hAnsi="Calibri" w:cs="Calibri"/>
+                <w:color w:val="1A1A1A"/>
+                <w:sz w:val="22"/>
+                <w:szCs w:val="22"/>
+              </w:rPr>
+              <w:t>: Gambar 1</w:t>
             </w:r>
           </w:p>
         </w:tc>
@@ -1377,7 +1759,7 @@
           <w:p>
             <w:pPr>
               <w:spacing w:before="80" w:after="160"/>
-              <w:jc w:val="center"/>
+              <w:jc w:val="both"/>
               <w:rPr>
                 <w:rFonts w:ascii="Calibri" w:eastAsia="Times New Roman" w:hAnsi="Calibri" w:cs="Calibri"/>
                 <w:b/>
@@ -1420,6 +1802,7 @@
           <w:p>
             <w:pPr>
               <w:spacing w:before="80" w:after="160"/>
+              <w:jc w:val="both"/>
               <w:rPr>
                 <w:rFonts w:ascii="Calibri" w:eastAsia="Times New Roman" w:hAnsi="Calibri" w:cs="Calibri"/>
                 <w:color w:val="1A1A1A"/>
@@ -1434,7 +1817,87 @@
                 <w:sz w:val="22"/>
                 <w:szCs w:val="22"/>
               </w:rPr>
-              <w:t xml:space="preserve">Emulator menyala atau ponsel terdeteksi di </w:t>
+              <w:t xml:space="preserve">Emulator </w:t>
+            </w:r>
+            <w:proofErr w:type="spellStart"/>
+            <w:r>
+              <w:rPr>
+                <w:rFonts w:ascii="Calibri" w:eastAsia="Times New Roman" w:hAnsi="Calibri" w:cs="Calibri"/>
+                <w:color w:val="1A1A1A"/>
+                <w:sz w:val="22"/>
+                <w:szCs w:val="22"/>
+              </w:rPr>
+              <w:t>menyala</w:t>
+            </w:r>
+            <w:proofErr w:type="spellEnd"/>
+            <w:r>
+              <w:rPr>
+                <w:rFonts w:ascii="Calibri" w:eastAsia="Times New Roman" w:hAnsi="Calibri" w:cs="Calibri"/>
+                <w:color w:val="1A1A1A"/>
+                <w:sz w:val="22"/>
+                <w:szCs w:val="22"/>
+              </w:rPr>
+              <w:t xml:space="preserve"> </w:t>
+            </w:r>
+            <w:proofErr w:type="spellStart"/>
+            <w:r>
+              <w:rPr>
+                <w:rFonts w:ascii="Calibri" w:eastAsia="Times New Roman" w:hAnsi="Calibri" w:cs="Calibri"/>
+                <w:color w:val="1A1A1A"/>
+                <w:sz w:val="22"/>
+                <w:szCs w:val="22"/>
+              </w:rPr>
+              <w:t>atau</w:t>
+            </w:r>
+            <w:proofErr w:type="spellEnd"/>
+            <w:r>
+              <w:rPr>
+                <w:rFonts w:ascii="Calibri" w:eastAsia="Times New Roman" w:hAnsi="Calibri" w:cs="Calibri"/>
+                <w:color w:val="1A1A1A"/>
+                <w:sz w:val="22"/>
+                <w:szCs w:val="22"/>
+              </w:rPr>
+              <w:t xml:space="preserve"> </w:t>
+            </w:r>
+            <w:proofErr w:type="spellStart"/>
+            <w:r>
+              <w:rPr>
+                <w:rFonts w:ascii="Calibri" w:eastAsia="Times New Roman" w:hAnsi="Calibri" w:cs="Calibri"/>
+                <w:color w:val="1A1A1A"/>
+                <w:sz w:val="22"/>
+                <w:szCs w:val="22"/>
+              </w:rPr>
+              <w:t>ponsel</w:t>
+            </w:r>
+            <w:proofErr w:type="spellEnd"/>
+            <w:r>
+              <w:rPr>
+                <w:rFonts w:ascii="Calibri" w:eastAsia="Times New Roman" w:hAnsi="Calibri" w:cs="Calibri"/>
+                <w:color w:val="1A1A1A"/>
+                <w:sz w:val="22"/>
+                <w:szCs w:val="22"/>
+              </w:rPr>
+              <w:t xml:space="preserve"> </w:t>
+            </w:r>
+            <w:proofErr w:type="spellStart"/>
+            <w:r>
+              <w:rPr>
+                <w:rFonts w:ascii="Calibri" w:eastAsia="Times New Roman" w:hAnsi="Calibri" w:cs="Calibri"/>
+                <w:color w:val="1A1A1A"/>
+                <w:sz w:val="22"/>
+                <w:szCs w:val="22"/>
+              </w:rPr>
+              <w:t>terdeteksi</w:t>
+            </w:r>
+            <w:proofErr w:type="spellEnd"/>
+            <w:r>
+              <w:rPr>
+                <w:rFonts w:ascii="Calibri" w:eastAsia="Times New Roman" w:hAnsi="Calibri" w:cs="Calibri"/>
+                <w:color w:val="1A1A1A"/>
+                <w:sz w:val="22"/>
+                <w:szCs w:val="22"/>
+              </w:rPr>
+              <w:t xml:space="preserve"> di </w:t>
             </w:r>
             <w:r>
               <w:rPr>
@@ -1465,6 +1928,7 @@
           <w:p>
             <w:pPr>
               <w:spacing w:before="80" w:after="160"/>
+              <w:jc w:val="both"/>
               <w:rPr>
                 <w:rFonts w:ascii="Calibri" w:eastAsia="Times New Roman" w:hAnsi="Calibri" w:cs="Calibri"/>
                 <w:color w:val="1A1A1A"/>
@@ -1479,7 +1943,27 @@
                 <w:sz w:val="22"/>
                 <w:szCs w:val="22"/>
               </w:rPr>
-              <w:t>Nama perangkat: Xiaomi 15T (25069PTEBG), Android 16 (API 36)</w:t>
+              <w:t xml:space="preserve">Nama </w:t>
+            </w:r>
+            <w:proofErr w:type="spellStart"/>
+            <w:r>
+              <w:rPr>
+                <w:rFonts w:ascii="Calibri" w:eastAsia="Times New Roman" w:hAnsi="Calibri" w:cs="Calibri"/>
+                <w:color w:val="1A1A1A"/>
+                <w:sz w:val="22"/>
+                <w:szCs w:val="22"/>
+              </w:rPr>
+              <w:t>perangkat</w:t>
+            </w:r>
+            <w:proofErr w:type="spellEnd"/>
+            <w:r>
+              <w:rPr>
+                <w:rFonts w:ascii="Calibri" w:eastAsia="Times New Roman" w:hAnsi="Calibri" w:cs="Calibri"/>
+                <w:color w:val="1A1A1A"/>
+                <w:sz w:val="22"/>
+                <w:szCs w:val="22"/>
+              </w:rPr>
+              <w:t>: Xiaomi 15T (25069PTEBG), Android 16 (API 36)</w:t>
             </w:r>
           </w:p>
         </w:tc>
@@ -1505,7 +1989,7 @@
           <w:p>
             <w:pPr>
               <w:spacing w:before="80" w:after="160"/>
-              <w:jc w:val="center"/>
+              <w:jc w:val="both"/>
               <w:rPr>
                 <w:rFonts w:ascii="Calibri" w:eastAsia="Times New Roman" w:hAnsi="Calibri" w:cs="Calibri"/>
                 <w:b/>
@@ -1548,6 +2032,7 @@
           <w:p>
             <w:pPr>
               <w:spacing w:before="80" w:after="160"/>
+              <w:jc w:val="both"/>
               <w:rPr>
                 <w:rFonts w:ascii="Calibri" w:eastAsia="Times New Roman" w:hAnsi="Calibri" w:cs="Calibri"/>
                 <w:color w:val="1A1A1A"/>
@@ -1555,15 +2040,27 @@
                 <w:szCs w:val="22"/>
               </w:rPr>
             </w:pPr>
-            <w:r>
-              <w:rPr>
-                <w:rFonts w:ascii="Calibri" w:eastAsia="Times New Roman" w:hAnsi="Calibri" w:cs="Calibri"/>
-                <w:color w:val="1A1A1A"/>
-                <w:sz w:val="22"/>
-                <w:szCs w:val="22"/>
-              </w:rPr>
-              <w:t xml:space="preserve">Proyek </w:t>
-            </w:r>
+            <w:proofErr w:type="spellStart"/>
+            <w:r>
+              <w:rPr>
+                <w:rFonts w:ascii="Calibri" w:eastAsia="Times New Roman" w:hAnsi="Calibri" w:cs="Calibri"/>
+                <w:color w:val="1A1A1A"/>
+                <w:sz w:val="22"/>
+                <w:szCs w:val="22"/>
+              </w:rPr>
+              <w:t>Proyek</w:t>
+            </w:r>
+            <w:proofErr w:type="spellEnd"/>
+            <w:r>
+              <w:rPr>
+                <w:rFonts w:ascii="Calibri" w:eastAsia="Times New Roman" w:hAnsi="Calibri" w:cs="Calibri"/>
+                <w:color w:val="1A1A1A"/>
+                <w:sz w:val="22"/>
+                <w:szCs w:val="22"/>
+              </w:rPr>
+              <w:t xml:space="preserve"> </w:t>
+            </w:r>
+            <w:proofErr w:type="spellStart"/>
             <w:r>
               <w:rPr>
                 <w:rStyle w:val="HTMLCode"/>
@@ -1571,15 +2068,67 @@
               </w:rPr>
               <w:t>hello_unimed</w:t>
             </w:r>
-            <w:r>
-              <w:rPr>
-                <w:rFonts w:ascii="Calibri" w:eastAsia="Times New Roman" w:hAnsi="Calibri" w:cs="Calibri"/>
-                <w:color w:val="1A1A1A"/>
-                <w:sz w:val="22"/>
-                <w:szCs w:val="22"/>
-              </w:rPr>
-              <w:t xml:space="preserve"> dibuat dan aplikasi counter berjalan</w:t>
-            </w:r>
+            <w:proofErr w:type="spellEnd"/>
+            <w:r>
+              <w:rPr>
+                <w:rFonts w:ascii="Calibri" w:eastAsia="Times New Roman" w:hAnsi="Calibri" w:cs="Calibri"/>
+                <w:color w:val="1A1A1A"/>
+                <w:sz w:val="22"/>
+                <w:szCs w:val="22"/>
+              </w:rPr>
+              <w:t xml:space="preserve"> </w:t>
+            </w:r>
+            <w:proofErr w:type="spellStart"/>
+            <w:r>
+              <w:rPr>
+                <w:rFonts w:ascii="Calibri" w:eastAsia="Times New Roman" w:hAnsi="Calibri" w:cs="Calibri"/>
+                <w:color w:val="1A1A1A"/>
+                <w:sz w:val="22"/>
+                <w:szCs w:val="22"/>
+              </w:rPr>
+              <w:t>dibuat</w:t>
+            </w:r>
+            <w:proofErr w:type="spellEnd"/>
+            <w:r>
+              <w:rPr>
+                <w:rFonts w:ascii="Calibri" w:eastAsia="Times New Roman" w:hAnsi="Calibri" w:cs="Calibri"/>
+                <w:color w:val="1A1A1A"/>
+                <w:sz w:val="22"/>
+                <w:szCs w:val="22"/>
+              </w:rPr>
+              <w:t xml:space="preserve"> dan </w:t>
+            </w:r>
+            <w:proofErr w:type="spellStart"/>
+            <w:r>
+              <w:rPr>
+                <w:rFonts w:ascii="Calibri" w:eastAsia="Times New Roman" w:hAnsi="Calibri" w:cs="Calibri"/>
+                <w:color w:val="1A1A1A"/>
+                <w:sz w:val="22"/>
+                <w:szCs w:val="22"/>
+              </w:rPr>
+              <w:t>aplikasi</w:t>
+            </w:r>
+            <w:proofErr w:type="spellEnd"/>
+            <w:r>
+              <w:rPr>
+                <w:rFonts w:ascii="Calibri" w:eastAsia="Times New Roman" w:hAnsi="Calibri" w:cs="Calibri"/>
+                <w:color w:val="1A1A1A"/>
+                <w:sz w:val="22"/>
+                <w:szCs w:val="22"/>
+              </w:rPr>
+              <w:t xml:space="preserve"> counter </w:t>
+            </w:r>
+            <w:proofErr w:type="spellStart"/>
+            <w:r>
+              <w:rPr>
+                <w:rFonts w:ascii="Calibri" w:eastAsia="Times New Roman" w:hAnsi="Calibri" w:cs="Calibri"/>
+                <w:color w:val="1A1A1A"/>
+                <w:sz w:val="22"/>
+                <w:szCs w:val="22"/>
+              </w:rPr>
+              <w:t>berjalan</w:t>
+            </w:r>
+            <w:proofErr w:type="spellEnd"/>
           </w:p>
         </w:tc>
         <w:tc>
@@ -1602,6 +2151,7 @@
           <w:p>
             <w:pPr>
               <w:spacing w:before="80" w:after="160"/>
+              <w:jc w:val="both"/>
               <w:rPr>
                 <w:rFonts w:ascii="Calibri" w:eastAsia="Times New Roman" w:hAnsi="Calibri" w:cs="Calibri"/>
                 <w:color w:val="1A1A1A"/>
@@ -1609,46 +2159,246 @@
                 <w:szCs w:val="22"/>
               </w:rPr>
             </w:pPr>
-            <w:r>
-              <w:rPr>
-                <w:rFonts w:ascii="Calibri" w:eastAsia="Times New Roman" w:hAnsi="Calibri" w:cs="Calibri"/>
-                <w:color w:val="1A1A1A"/>
-                <w:sz w:val="22"/>
-                <w:szCs w:val="22"/>
-              </w:rPr>
-              <w:t xml:space="preserve">Proyek dibuat dengan </w:t>
+            <w:proofErr w:type="spellStart"/>
+            <w:r>
+              <w:rPr>
+                <w:rFonts w:ascii="Calibri" w:eastAsia="Times New Roman" w:hAnsi="Calibri" w:cs="Calibri"/>
+                <w:color w:val="1A1A1A"/>
+                <w:sz w:val="22"/>
+                <w:szCs w:val="22"/>
+              </w:rPr>
+              <w:t>Proyek</w:t>
+            </w:r>
+            <w:proofErr w:type="spellEnd"/>
+            <w:r>
+              <w:rPr>
+                <w:rFonts w:ascii="Calibri" w:eastAsia="Times New Roman" w:hAnsi="Calibri" w:cs="Calibri"/>
+                <w:color w:val="1A1A1A"/>
+                <w:sz w:val="22"/>
+                <w:szCs w:val="22"/>
+              </w:rPr>
+              <w:t xml:space="preserve"> </w:t>
+            </w:r>
+            <w:proofErr w:type="spellStart"/>
+            <w:r>
+              <w:rPr>
+                <w:rFonts w:ascii="Calibri" w:eastAsia="Times New Roman" w:hAnsi="Calibri" w:cs="Calibri"/>
+                <w:color w:val="1A1A1A"/>
+                <w:sz w:val="22"/>
+                <w:szCs w:val="22"/>
+              </w:rPr>
+              <w:t>dibuat</w:t>
+            </w:r>
+            <w:proofErr w:type="spellEnd"/>
+            <w:r>
+              <w:rPr>
+                <w:rFonts w:ascii="Calibri" w:eastAsia="Times New Roman" w:hAnsi="Calibri" w:cs="Calibri"/>
+                <w:color w:val="1A1A1A"/>
+                <w:sz w:val="22"/>
+                <w:szCs w:val="22"/>
+              </w:rPr>
+              <w:t xml:space="preserve"> </w:t>
+            </w:r>
+            <w:proofErr w:type="spellStart"/>
+            <w:r>
+              <w:rPr>
+                <w:rFonts w:ascii="Calibri" w:eastAsia="Times New Roman" w:hAnsi="Calibri" w:cs="Calibri"/>
+                <w:color w:val="1A1A1A"/>
+                <w:sz w:val="22"/>
+                <w:szCs w:val="22"/>
+              </w:rPr>
+              <w:t>dengan</w:t>
+            </w:r>
+            <w:proofErr w:type="spellEnd"/>
+            <w:r>
+              <w:rPr>
+                <w:rFonts w:ascii="Calibri" w:eastAsia="Times New Roman" w:hAnsi="Calibri" w:cs="Calibri"/>
+                <w:color w:val="1A1A1A"/>
+                <w:sz w:val="22"/>
+                <w:szCs w:val="22"/>
+              </w:rPr>
+              <w:t xml:space="preserve"> </w:t>
             </w:r>
             <w:r>
               <w:rPr>
                 <w:rStyle w:val="HTMLCode"/>
                 <w:color w:val="1A1A1A"/>
               </w:rPr>
-              <w:t>flutter create --org id.ac.unimed hello_unimed</w:t>
-            </w:r>
-            <w:r>
-              <w:rPr>
-                <w:rFonts w:ascii="Calibri" w:eastAsia="Times New Roman" w:hAnsi="Calibri" w:cs="Calibri"/>
-                <w:color w:val="1A1A1A"/>
-                <w:sz w:val="22"/>
-                <w:szCs w:val="22"/>
-              </w:rPr>
-              <w:t xml:space="preserve">. Aplikasi counter bawaan dijalankan di Xiaomi 15T (proyek </w:t>
-            </w:r>
+              <w:t xml:space="preserve">flutter create --org </w:t>
+            </w:r>
+            <w:proofErr w:type="spellStart"/>
+            <w:proofErr w:type="gramStart"/>
             <w:r>
               <w:rPr>
                 <w:rStyle w:val="HTMLCode"/>
                 <w:color w:val="1A1A1A"/>
               </w:rPr>
+              <w:t>id.ac.unimed</w:t>
+            </w:r>
+            <w:proofErr w:type="spellEnd"/>
+            <w:proofErr w:type="gramEnd"/>
+            <w:r>
+              <w:rPr>
+                <w:rStyle w:val="HTMLCode"/>
+                <w:color w:val="1A1A1A"/>
+              </w:rPr>
+              <w:t xml:space="preserve"> </w:t>
+            </w:r>
+            <w:proofErr w:type="spellStart"/>
+            <w:r>
+              <w:rPr>
+                <w:rStyle w:val="HTMLCode"/>
+                <w:color w:val="1A1A1A"/>
+              </w:rPr>
+              <w:t>hello_unimed</w:t>
+            </w:r>
+            <w:proofErr w:type="spellEnd"/>
+            <w:r>
+              <w:rPr>
+                <w:rFonts w:ascii="Calibri" w:eastAsia="Times New Roman" w:hAnsi="Calibri" w:cs="Calibri"/>
+                <w:color w:val="1A1A1A"/>
+                <w:sz w:val="22"/>
+                <w:szCs w:val="22"/>
+              </w:rPr>
+              <w:t xml:space="preserve">. </w:t>
+            </w:r>
+            <w:proofErr w:type="spellStart"/>
+            <w:r>
+              <w:rPr>
+                <w:rFonts w:ascii="Calibri" w:eastAsia="Times New Roman" w:hAnsi="Calibri" w:cs="Calibri"/>
+                <w:color w:val="1A1A1A"/>
+                <w:sz w:val="22"/>
+                <w:szCs w:val="22"/>
+              </w:rPr>
+              <w:t>Aplikasi</w:t>
+            </w:r>
+            <w:proofErr w:type="spellEnd"/>
+            <w:r>
+              <w:rPr>
+                <w:rFonts w:ascii="Calibri" w:eastAsia="Times New Roman" w:hAnsi="Calibri" w:cs="Calibri"/>
+                <w:color w:val="1A1A1A"/>
+                <w:sz w:val="22"/>
+                <w:szCs w:val="22"/>
+              </w:rPr>
+              <w:t xml:space="preserve"> counter </w:t>
+            </w:r>
+            <w:proofErr w:type="spellStart"/>
+            <w:r>
+              <w:rPr>
+                <w:rFonts w:ascii="Calibri" w:eastAsia="Times New Roman" w:hAnsi="Calibri" w:cs="Calibri"/>
+                <w:color w:val="1A1A1A"/>
+                <w:sz w:val="22"/>
+                <w:szCs w:val="22"/>
+              </w:rPr>
+              <w:t>bawaan</w:t>
+            </w:r>
+            <w:proofErr w:type="spellEnd"/>
+            <w:r>
+              <w:rPr>
+                <w:rFonts w:ascii="Calibri" w:eastAsia="Times New Roman" w:hAnsi="Calibri" w:cs="Calibri"/>
+                <w:color w:val="1A1A1A"/>
+                <w:sz w:val="22"/>
+                <w:szCs w:val="22"/>
+              </w:rPr>
+              <w:t xml:space="preserve"> </w:t>
+            </w:r>
+            <w:proofErr w:type="spellStart"/>
+            <w:r>
+              <w:rPr>
+                <w:rFonts w:ascii="Calibri" w:eastAsia="Times New Roman" w:hAnsi="Calibri" w:cs="Calibri"/>
+                <w:color w:val="1A1A1A"/>
+                <w:sz w:val="22"/>
+                <w:szCs w:val="22"/>
+              </w:rPr>
+              <w:t>dijalankan</w:t>
+            </w:r>
+            <w:proofErr w:type="spellEnd"/>
+            <w:r>
+              <w:rPr>
+                <w:rFonts w:ascii="Calibri" w:eastAsia="Times New Roman" w:hAnsi="Calibri" w:cs="Calibri"/>
+                <w:color w:val="1A1A1A"/>
+                <w:sz w:val="22"/>
+                <w:szCs w:val="22"/>
+              </w:rPr>
+              <w:t xml:space="preserve"> di Xiaomi 15T (</w:t>
+            </w:r>
+            <w:proofErr w:type="spellStart"/>
+            <w:r>
+              <w:rPr>
+                <w:rFonts w:ascii="Calibri" w:eastAsia="Times New Roman" w:hAnsi="Calibri" w:cs="Calibri"/>
+                <w:color w:val="1A1A1A"/>
+                <w:sz w:val="22"/>
+                <w:szCs w:val="22"/>
+              </w:rPr>
+              <w:t>proyek</w:t>
+            </w:r>
+            <w:proofErr w:type="spellEnd"/>
+            <w:r>
+              <w:rPr>
+                <w:rFonts w:ascii="Calibri" w:eastAsia="Times New Roman" w:hAnsi="Calibri" w:cs="Calibri"/>
+                <w:color w:val="1A1A1A"/>
+                <w:sz w:val="22"/>
+                <w:szCs w:val="22"/>
+              </w:rPr>
+              <w:t xml:space="preserve"> </w:t>
+            </w:r>
+            <w:proofErr w:type="spellStart"/>
+            <w:r>
+              <w:rPr>
+                <w:rStyle w:val="HTMLCode"/>
+                <w:color w:val="1A1A1A"/>
+              </w:rPr>
               <w:t>coba_counter</w:t>
             </w:r>
-            <w:r>
-              <w:rPr>
-                <w:rFonts w:ascii="Calibri" w:eastAsia="Times New Roman" w:hAnsi="Calibri" w:cs="Calibri"/>
-                <w:color w:val="1A1A1A"/>
-                <w:sz w:val="22"/>
-                <w:szCs w:val="22"/>
-              </w:rPr>
-              <w:t>); tombol + ditekan 5 kali.</w:t>
+            <w:proofErr w:type="spellEnd"/>
+            <w:r>
+              <w:rPr>
+                <w:rFonts w:ascii="Calibri" w:eastAsia="Times New Roman" w:hAnsi="Calibri" w:cs="Calibri"/>
+                <w:color w:val="1A1A1A"/>
+                <w:sz w:val="22"/>
+                <w:szCs w:val="22"/>
+              </w:rPr>
+              <w:t xml:space="preserve">); </w:t>
+            </w:r>
+            <w:proofErr w:type="spellStart"/>
+            <w:r>
+              <w:rPr>
+                <w:rFonts w:ascii="Calibri" w:eastAsia="Times New Roman" w:hAnsi="Calibri" w:cs="Calibri"/>
+                <w:color w:val="1A1A1A"/>
+                <w:sz w:val="22"/>
+                <w:szCs w:val="22"/>
+              </w:rPr>
+              <w:t>tombol</w:t>
+            </w:r>
+            <w:proofErr w:type="spellEnd"/>
+            <w:r>
+              <w:rPr>
+                <w:rFonts w:ascii="Calibri" w:eastAsia="Times New Roman" w:hAnsi="Calibri" w:cs="Calibri"/>
+                <w:color w:val="1A1A1A"/>
+                <w:sz w:val="22"/>
+                <w:szCs w:val="22"/>
+              </w:rPr>
+              <w:t xml:space="preserve"> + </w:t>
+            </w:r>
+            <w:proofErr w:type="spellStart"/>
+            <w:r>
+              <w:rPr>
+                <w:rFonts w:ascii="Calibri" w:eastAsia="Times New Roman" w:hAnsi="Calibri" w:cs="Calibri"/>
+                <w:color w:val="1A1A1A"/>
+                <w:sz w:val="22"/>
+                <w:szCs w:val="22"/>
+              </w:rPr>
+              <w:t>ditekan</w:t>
+            </w:r>
+            <w:proofErr w:type="spellEnd"/>
+            <w:r>
+              <w:rPr>
+                <w:rFonts w:ascii="Calibri" w:eastAsia="Times New Roman" w:hAnsi="Calibri" w:cs="Calibri"/>
+                <w:color w:val="1A1A1A"/>
+                <w:sz w:val="22"/>
+                <w:szCs w:val="22"/>
+              </w:rPr>
+              <w:t xml:space="preserve"> 5 kali.</w:t>
             </w:r>
           </w:p>
         </w:tc>
@@ -1674,7 +2424,7 @@
           <w:p>
             <w:pPr>
               <w:spacing w:before="80" w:after="160"/>
-              <w:jc w:val="center"/>
+              <w:jc w:val="both"/>
               <w:rPr>
                 <w:rFonts w:ascii="Calibri" w:eastAsia="Times New Roman" w:hAnsi="Calibri" w:cs="Calibri"/>
                 <w:b/>
@@ -1718,6 +2468,7 @@
           <w:p>
             <w:pPr>
               <w:spacing w:before="80" w:after="160"/>
+              <w:jc w:val="both"/>
               <w:rPr>
                 <w:rFonts w:ascii="Calibri" w:eastAsia="Times New Roman" w:hAnsi="Calibri" w:cs="Calibri"/>
                 <w:color w:val="1A1A1A"/>
@@ -1732,7 +2483,87 @@
                 <w:sz w:val="22"/>
                 <w:szCs w:val="22"/>
               </w:rPr>
-              <w:t>Hot reload dicoba (ubah warna tema)</w:t>
+              <w:t xml:space="preserve">Hot reload </w:t>
+            </w:r>
+            <w:proofErr w:type="spellStart"/>
+            <w:r>
+              <w:rPr>
+                <w:rFonts w:ascii="Calibri" w:eastAsia="Times New Roman" w:hAnsi="Calibri" w:cs="Calibri"/>
+                <w:color w:val="1A1A1A"/>
+                <w:sz w:val="22"/>
+                <w:szCs w:val="22"/>
+              </w:rPr>
+              <w:t>dicoba</w:t>
+            </w:r>
+            <w:proofErr w:type="spellEnd"/>
+            <w:r>
+              <w:rPr>
+                <w:rFonts w:ascii="Calibri" w:eastAsia="Times New Roman" w:hAnsi="Calibri" w:cs="Calibri"/>
+                <w:color w:val="1A1A1A"/>
+                <w:sz w:val="22"/>
+                <w:szCs w:val="22"/>
+              </w:rPr>
+              <w:t xml:space="preserve"> (</w:t>
+            </w:r>
+            <w:proofErr w:type="spellStart"/>
+            <w:r>
+              <w:rPr>
+                <w:rFonts w:ascii="Calibri" w:eastAsia="Times New Roman" w:hAnsi="Calibri" w:cs="Calibri"/>
+                <w:color w:val="1A1A1A"/>
+                <w:sz w:val="22"/>
+                <w:szCs w:val="22"/>
+              </w:rPr>
+              <w:t>ubah</w:t>
+            </w:r>
+            <w:proofErr w:type="spellEnd"/>
+            <w:r>
+              <w:rPr>
+                <w:rFonts w:ascii="Calibri" w:eastAsia="Times New Roman" w:hAnsi="Calibri" w:cs="Calibri"/>
+                <w:color w:val="1A1A1A"/>
+                <w:sz w:val="22"/>
+                <w:szCs w:val="22"/>
+              </w:rPr>
+              <w:t xml:space="preserve"> </w:t>
+            </w:r>
+            <w:proofErr w:type="spellStart"/>
+            <w:r>
+              <w:rPr>
+                <w:rFonts w:ascii="Calibri" w:eastAsia="Times New Roman" w:hAnsi="Calibri" w:cs="Calibri"/>
+                <w:color w:val="1A1A1A"/>
+                <w:sz w:val="22"/>
+                <w:szCs w:val="22"/>
+              </w:rPr>
+              <w:t>warna</w:t>
+            </w:r>
+            <w:proofErr w:type="spellEnd"/>
+            <w:r>
+              <w:rPr>
+                <w:rFonts w:ascii="Calibri" w:eastAsia="Times New Roman" w:hAnsi="Calibri" w:cs="Calibri"/>
+                <w:color w:val="1A1A1A"/>
+                <w:sz w:val="22"/>
+                <w:szCs w:val="22"/>
+              </w:rPr>
+              <w:t xml:space="preserve"> </w:t>
+            </w:r>
+            <w:proofErr w:type="spellStart"/>
+            <w:r>
+              <w:rPr>
+                <w:rFonts w:ascii="Calibri" w:eastAsia="Times New Roman" w:hAnsi="Calibri" w:cs="Calibri"/>
+                <w:color w:val="1A1A1A"/>
+                <w:sz w:val="22"/>
+                <w:szCs w:val="22"/>
+              </w:rPr>
+              <w:t>tema</w:t>
+            </w:r>
+            <w:proofErr w:type="spellEnd"/>
+            <w:r>
+              <w:rPr>
+                <w:rFonts w:ascii="Calibri" w:eastAsia="Times New Roman" w:hAnsi="Calibri" w:cs="Calibri"/>
+                <w:color w:val="1A1A1A"/>
+                <w:sz w:val="22"/>
+                <w:szCs w:val="22"/>
+              </w:rPr>
+              <w:t>)</w:t>
             </w:r>
           </w:p>
         </w:tc>
@@ -1756,6 +2587,7 @@
           <w:p>
             <w:pPr>
               <w:spacing w:before="80" w:after="160"/>
+              <w:jc w:val="both"/>
               <w:rPr>
                 <w:rFonts w:ascii="Calibri" w:eastAsia="Times New Roman" w:hAnsi="Calibri" w:cs="Calibri"/>
                 <w:color w:val="1A1A1A"/>
@@ -1763,6 +2595,7 @@
                 <w:szCs w:val="22"/>
               </w:rPr>
             </w:pPr>
+            <w:proofErr w:type="spellStart"/>
             <w:r>
               <w:rPr>
                 <w:rStyle w:val="HTMLCode"/>
@@ -1770,15 +2603,37 @@
               </w:rPr>
               <w:t>Colors.deepPurple</w:t>
             </w:r>
-            <w:r>
-              <w:rPr>
-                <w:rFonts w:ascii="Calibri" w:eastAsia="Times New Roman" w:hAnsi="Calibri" w:cs="Calibri"/>
-                <w:color w:val="1A1A1A"/>
-                <w:sz w:val="22"/>
-                <w:szCs w:val="22"/>
-              </w:rPr>
-              <w:t xml:space="preserve"> diganti </w:t>
-            </w:r>
+            <w:proofErr w:type="spellEnd"/>
+            <w:r>
+              <w:rPr>
+                <w:rFonts w:ascii="Calibri" w:eastAsia="Times New Roman" w:hAnsi="Calibri" w:cs="Calibri"/>
+                <w:color w:val="1A1A1A"/>
+                <w:sz w:val="22"/>
+                <w:szCs w:val="22"/>
+              </w:rPr>
+              <w:t xml:space="preserve"> </w:t>
+            </w:r>
+            <w:proofErr w:type="spellStart"/>
+            <w:r>
+              <w:rPr>
+                <w:rFonts w:ascii="Calibri" w:eastAsia="Times New Roman" w:hAnsi="Calibri" w:cs="Calibri"/>
+                <w:color w:val="1A1A1A"/>
+                <w:sz w:val="22"/>
+                <w:szCs w:val="22"/>
+              </w:rPr>
+              <w:t>diganti</w:t>
+            </w:r>
+            <w:proofErr w:type="spellEnd"/>
+            <w:r>
+              <w:rPr>
+                <w:rFonts w:ascii="Calibri" w:eastAsia="Times New Roman" w:hAnsi="Calibri" w:cs="Calibri"/>
+                <w:color w:val="1A1A1A"/>
+                <w:sz w:val="22"/>
+                <w:szCs w:val="22"/>
+              </w:rPr>
+              <w:t xml:space="preserve"> </w:t>
+            </w:r>
+            <w:proofErr w:type="spellStart"/>
             <w:r>
               <w:rPr>
                 <w:rStyle w:val="HTMLCode"/>
@@ -1786,14 +2641,35 @@
               </w:rPr>
               <w:t>Colors.green</w:t>
             </w:r>
-            <w:r>
-              <w:rPr>
-                <w:rFonts w:ascii="Calibri" w:eastAsia="Times New Roman" w:hAnsi="Calibri" w:cs="Calibri"/>
-                <w:color w:val="1A1A1A"/>
-                <w:sz w:val="22"/>
-                <w:szCs w:val="22"/>
-              </w:rPr>
-              <w:t xml:space="preserve">, lalu </w:t>
+            <w:proofErr w:type="spellEnd"/>
+            <w:r>
+              <w:rPr>
+                <w:rFonts w:ascii="Calibri" w:eastAsia="Times New Roman" w:hAnsi="Calibri" w:cs="Calibri"/>
+                <w:color w:val="1A1A1A"/>
+                <w:sz w:val="22"/>
+                <w:szCs w:val="22"/>
+              </w:rPr>
+              <w:t xml:space="preserve">, </w:t>
+            </w:r>
+            <w:proofErr w:type="spellStart"/>
+            <w:r>
+              <w:rPr>
+                <w:rFonts w:ascii="Calibri" w:eastAsia="Times New Roman" w:hAnsi="Calibri" w:cs="Calibri"/>
+                <w:color w:val="1A1A1A"/>
+                <w:sz w:val="22"/>
+                <w:szCs w:val="22"/>
+              </w:rPr>
+              <w:t>lalu</w:t>
+            </w:r>
+            <w:proofErr w:type="spellEnd"/>
+            <w:r>
+              <w:rPr>
+                <w:rFonts w:ascii="Calibri" w:eastAsia="Times New Roman" w:hAnsi="Calibri" w:cs="Calibri"/>
+                <w:color w:val="1A1A1A"/>
+                <w:sz w:val="22"/>
+                <w:szCs w:val="22"/>
+              </w:rPr>
+              <w:t xml:space="preserve"> </w:t>
             </w:r>
             <w:r>
               <w:rPr>
@@ -1809,7 +2685,207 @@
                 <w:sz w:val="22"/>
                 <w:szCs w:val="22"/>
               </w:rPr>
-              <w:t xml:space="preserve"> ditekan: tema langsung berubah menjadi hijau tanpa memulai ulang aplikasi.</w:t>
+              <w:t xml:space="preserve"> </w:t>
+            </w:r>
+            <w:proofErr w:type="spellStart"/>
+            <w:r>
+              <w:rPr>
+                <w:rFonts w:ascii="Calibri" w:eastAsia="Times New Roman" w:hAnsi="Calibri" w:cs="Calibri"/>
+                <w:color w:val="1A1A1A"/>
+                <w:sz w:val="22"/>
+                <w:szCs w:val="22"/>
+              </w:rPr>
+              <w:t>ditekan</w:t>
+            </w:r>
+            <w:proofErr w:type="spellEnd"/>
+            <w:r>
+              <w:rPr>
+                <w:rFonts w:ascii="Calibri" w:eastAsia="Times New Roman" w:hAnsi="Calibri" w:cs="Calibri"/>
+                <w:color w:val="1A1A1A"/>
+                <w:sz w:val="22"/>
+                <w:szCs w:val="22"/>
+              </w:rPr>
+              <w:t xml:space="preserve">: </w:t>
+            </w:r>
+            <w:proofErr w:type="spellStart"/>
+            <w:r>
+              <w:rPr>
+                <w:rFonts w:ascii="Calibri" w:eastAsia="Times New Roman" w:hAnsi="Calibri" w:cs="Calibri"/>
+                <w:color w:val="1A1A1A"/>
+                <w:sz w:val="22"/>
+                <w:szCs w:val="22"/>
+              </w:rPr>
+              <w:t>tema</w:t>
+            </w:r>
+            <w:proofErr w:type="spellEnd"/>
+            <w:r>
+              <w:rPr>
+                <w:rFonts w:ascii="Calibri" w:eastAsia="Times New Roman" w:hAnsi="Calibri" w:cs="Calibri"/>
+                <w:color w:val="1A1A1A"/>
+                <w:sz w:val="22"/>
+                <w:szCs w:val="22"/>
+              </w:rPr>
+              <w:t xml:space="preserve"> </w:t>
+            </w:r>
+            <w:proofErr w:type="spellStart"/>
+            <w:r>
+              <w:rPr>
+                <w:rFonts w:ascii="Calibri" w:eastAsia="Times New Roman" w:hAnsi="Calibri" w:cs="Calibri"/>
+                <w:color w:val="1A1A1A"/>
+                <w:sz w:val="22"/>
+                <w:szCs w:val="22"/>
+              </w:rPr>
+              <w:t>langsung</w:t>
+            </w:r>
+            <w:proofErr w:type="spellEnd"/>
+            <w:r>
+              <w:rPr>
+                <w:rFonts w:ascii="Calibri" w:eastAsia="Times New Roman" w:hAnsi="Calibri" w:cs="Calibri"/>
+                <w:color w:val="1A1A1A"/>
+                <w:sz w:val="22"/>
+                <w:szCs w:val="22"/>
+              </w:rPr>
+              <w:t xml:space="preserve"> </w:t>
+            </w:r>
+            <w:proofErr w:type="spellStart"/>
+            <w:r>
+              <w:rPr>
+                <w:rFonts w:ascii="Calibri" w:eastAsia="Times New Roman" w:hAnsi="Calibri" w:cs="Calibri"/>
+                <w:color w:val="1A1A1A"/>
+                <w:sz w:val="22"/>
+                <w:szCs w:val="22"/>
+              </w:rPr>
+              <w:t>berubah</w:t>
+            </w:r>
+            <w:proofErr w:type="spellEnd"/>
+            <w:r>
+              <w:rPr>
+                <w:rFonts w:ascii="Calibri" w:eastAsia="Times New Roman" w:hAnsi="Calibri" w:cs="Calibri"/>
+                <w:color w:val="1A1A1A"/>
+                <w:sz w:val="22"/>
+                <w:szCs w:val="22"/>
+              </w:rPr>
+              <w:t xml:space="preserve"> </w:t>
+            </w:r>
+            <w:proofErr w:type="spellStart"/>
+            <w:r>
+              <w:rPr>
+                <w:rFonts w:ascii="Calibri" w:eastAsia="Times New Roman" w:hAnsi="Calibri" w:cs="Calibri"/>
+                <w:color w:val="1A1A1A"/>
+                <w:sz w:val="22"/>
+                <w:szCs w:val="22"/>
+              </w:rPr>
+              <w:t>menjadi</w:t>
+            </w:r>
+            <w:proofErr w:type="spellEnd"/>
+            <w:r>
+              <w:rPr>
+                <w:rFonts w:ascii="Calibri" w:eastAsia="Times New Roman" w:hAnsi="Calibri" w:cs="Calibri"/>
+                <w:color w:val="1A1A1A"/>
+                <w:sz w:val="22"/>
+                <w:szCs w:val="22"/>
+              </w:rPr>
+              <w:t xml:space="preserve"> </w:t>
+            </w:r>
+            <w:proofErr w:type="spellStart"/>
+            <w:r>
+              <w:rPr>
+                <w:rFonts w:ascii="Calibri" w:eastAsia="Times New Roman" w:hAnsi="Calibri" w:cs="Calibri"/>
+                <w:color w:val="1A1A1A"/>
+                <w:sz w:val="22"/>
+                <w:szCs w:val="22"/>
+              </w:rPr>
+              <w:t>hijau</w:t>
+            </w:r>
+            <w:proofErr w:type="spellEnd"/>
+            <w:r>
+              <w:rPr>
+                <w:rFonts w:ascii="Calibri" w:eastAsia="Times New Roman" w:hAnsi="Calibri" w:cs="Calibri"/>
+                <w:color w:val="1A1A1A"/>
+                <w:sz w:val="22"/>
+                <w:szCs w:val="22"/>
+              </w:rPr>
+              <w:t xml:space="preserve"> </w:t>
+            </w:r>
+            <w:proofErr w:type="spellStart"/>
+            <w:r>
+              <w:rPr>
+                <w:rFonts w:ascii="Calibri" w:eastAsia="Times New Roman" w:hAnsi="Calibri" w:cs="Calibri"/>
+                <w:color w:val="1A1A1A"/>
+                <w:sz w:val="22"/>
+                <w:szCs w:val="22"/>
+              </w:rPr>
+              <w:t>tanpa</w:t>
+            </w:r>
+            <w:proofErr w:type="spellEnd"/>
+            <w:r>
+              <w:rPr>
+                <w:rFonts w:ascii="Calibri" w:eastAsia="Times New Roman" w:hAnsi="Calibri" w:cs="Calibri"/>
+                <w:color w:val="1A1A1A"/>
+                <w:sz w:val="22"/>
+                <w:szCs w:val="22"/>
+              </w:rPr>
+              <w:t xml:space="preserve"> </w:t>
+            </w:r>
+            <w:proofErr w:type="spellStart"/>
+            <w:r>
+              <w:rPr>
+                <w:rFonts w:ascii="Calibri" w:eastAsia="Times New Roman" w:hAnsi="Calibri" w:cs="Calibri"/>
+                <w:color w:val="1A1A1A"/>
+                <w:sz w:val="22"/>
+                <w:szCs w:val="22"/>
+              </w:rPr>
+              <w:t>memulai</w:t>
+            </w:r>
+            <w:proofErr w:type="spellEnd"/>
+            <w:r>
+              <w:rPr>
+                <w:rFonts w:ascii="Calibri" w:eastAsia="Times New Roman" w:hAnsi="Calibri" w:cs="Calibri"/>
+                <w:color w:val="1A1A1A"/>
+                <w:sz w:val="22"/>
+                <w:szCs w:val="22"/>
+              </w:rPr>
+              <w:t xml:space="preserve"> </w:t>
+            </w:r>
+            <w:proofErr w:type="spellStart"/>
+            <w:r>
+              <w:rPr>
+                <w:rFonts w:ascii="Calibri" w:eastAsia="Times New Roman" w:hAnsi="Calibri" w:cs="Calibri"/>
+                <w:color w:val="1A1A1A"/>
+                <w:sz w:val="22"/>
+                <w:szCs w:val="22"/>
+              </w:rPr>
+              <w:t>ulang</w:t>
+            </w:r>
+            <w:proofErr w:type="spellEnd"/>
+            <w:r>
+              <w:rPr>
+                <w:rFonts w:ascii="Calibri" w:eastAsia="Times New Roman" w:hAnsi="Calibri" w:cs="Calibri"/>
+                <w:color w:val="1A1A1A"/>
+                <w:sz w:val="22"/>
+                <w:szCs w:val="22"/>
+              </w:rPr>
+              <w:t xml:space="preserve"> </w:t>
+            </w:r>
+            <w:proofErr w:type="spellStart"/>
+            <w:r>
+              <w:rPr>
+                <w:rFonts w:ascii="Calibri" w:eastAsia="Times New Roman" w:hAnsi="Calibri" w:cs="Calibri"/>
+                <w:color w:val="1A1A1A"/>
+                <w:sz w:val="22"/>
+                <w:szCs w:val="22"/>
+              </w:rPr>
+              <w:t>aplikasi</w:t>
+            </w:r>
+            <w:proofErr w:type="spellEnd"/>
+            <w:r>
+              <w:rPr>
+                <w:rFonts w:ascii="Calibri" w:eastAsia="Times New Roman" w:hAnsi="Calibri" w:cs="Calibri"/>
+                <w:color w:val="1A1A1A"/>
+                <w:sz w:val="22"/>
+                <w:szCs w:val="22"/>
+              </w:rPr>
+              <w:t>.</w:t>
             </w:r>
           </w:p>
         </w:tc>
@@ -1835,7 +2911,7 @@
           <w:p>
             <w:pPr>
               <w:spacing w:before="80" w:after="160"/>
-              <w:jc w:val="center"/>
+              <w:jc w:val="both"/>
               <w:rPr>
                 <w:rFonts w:ascii="Calibri" w:eastAsia="Times New Roman" w:hAnsi="Calibri" w:cs="Calibri"/>
                 <w:b/>
@@ -1878,6 +2954,7 @@
           <w:p>
             <w:pPr>
               <w:spacing w:before="80" w:after="160"/>
+              <w:jc w:val="both"/>
               <w:rPr>
                 <w:rFonts w:ascii="Calibri" w:eastAsia="Times New Roman" w:hAnsi="Calibri" w:cs="Calibri"/>
                 <w:color w:val="1A1A1A"/>
@@ -1892,8 +2969,79 @@
                 <w:sz w:val="22"/>
                 <w:szCs w:val="22"/>
               </w:rPr>
-              <w:t>Hello World dengan nama, NIM, dan kelas tampil di perangkat</w:t>
-            </w:r>
+              <w:t xml:space="preserve">Hello World </w:t>
+            </w:r>
+            <w:proofErr w:type="spellStart"/>
+            <w:r>
+              <w:rPr>
+                <w:rFonts w:ascii="Calibri" w:eastAsia="Times New Roman" w:hAnsi="Calibri" w:cs="Calibri"/>
+                <w:color w:val="1A1A1A"/>
+                <w:sz w:val="22"/>
+                <w:szCs w:val="22"/>
+              </w:rPr>
+              <w:t>dengan</w:t>
+            </w:r>
+            <w:proofErr w:type="spellEnd"/>
+            <w:r>
+              <w:rPr>
+                <w:rFonts w:ascii="Calibri" w:eastAsia="Times New Roman" w:hAnsi="Calibri" w:cs="Calibri"/>
+                <w:color w:val="1A1A1A"/>
+                <w:sz w:val="22"/>
+                <w:szCs w:val="22"/>
+              </w:rPr>
+              <w:t xml:space="preserve"> nama, NIM, dan </w:t>
+            </w:r>
+            <w:proofErr w:type="spellStart"/>
+            <w:r>
+              <w:rPr>
+                <w:rFonts w:ascii="Calibri" w:eastAsia="Times New Roman" w:hAnsi="Calibri" w:cs="Calibri"/>
+                <w:color w:val="1A1A1A"/>
+                <w:sz w:val="22"/>
+                <w:szCs w:val="22"/>
+              </w:rPr>
+              <w:t>kelas</w:t>
+            </w:r>
+            <w:proofErr w:type="spellEnd"/>
+            <w:r>
+              <w:rPr>
+                <w:rFonts w:ascii="Calibri" w:eastAsia="Times New Roman" w:hAnsi="Calibri" w:cs="Calibri"/>
+                <w:color w:val="1A1A1A"/>
+                <w:sz w:val="22"/>
+                <w:szCs w:val="22"/>
+              </w:rPr>
+              <w:t xml:space="preserve"> </w:t>
+            </w:r>
+            <w:proofErr w:type="spellStart"/>
+            <w:r>
+              <w:rPr>
+                <w:rFonts w:ascii="Calibri" w:eastAsia="Times New Roman" w:hAnsi="Calibri" w:cs="Calibri"/>
+                <w:color w:val="1A1A1A"/>
+                <w:sz w:val="22"/>
+                <w:szCs w:val="22"/>
+              </w:rPr>
+              <w:t>tampil</w:t>
+            </w:r>
+            <w:proofErr w:type="spellEnd"/>
+            <w:r>
+              <w:rPr>
+                <w:rFonts w:ascii="Calibri" w:eastAsia="Times New Roman" w:hAnsi="Calibri" w:cs="Calibri"/>
+                <w:color w:val="1A1A1A"/>
+                <w:sz w:val="22"/>
+                <w:szCs w:val="22"/>
+              </w:rPr>
+              <w:t xml:space="preserve"> di </w:t>
+            </w:r>
+            <w:proofErr w:type="spellStart"/>
+            <w:r>
+              <w:rPr>
+                <w:rFonts w:ascii="Calibri" w:eastAsia="Times New Roman" w:hAnsi="Calibri" w:cs="Calibri"/>
+                <w:color w:val="1A1A1A"/>
+                <w:sz w:val="22"/>
+                <w:szCs w:val="22"/>
+              </w:rPr>
+              <w:t>perangkat</w:t>
+            </w:r>
+            <w:proofErr w:type="spellEnd"/>
           </w:p>
         </w:tc>
         <w:tc>
@@ -1916,6 +3064,7 @@
           <w:p>
             <w:pPr>
               <w:spacing w:before="80" w:after="160"/>
+              <w:jc w:val="both"/>
               <w:rPr>
                 <w:rFonts w:ascii="Calibri" w:eastAsia="Times New Roman" w:hAnsi="Calibri" w:cs="Calibri"/>
                 <w:color w:val="1A1A1A"/>
@@ -1923,14 +3072,45 @@
                 <w:szCs w:val="22"/>
               </w:rPr>
             </w:pPr>
-            <w:r>
-              <w:rPr>
-                <w:rFonts w:ascii="Calibri" w:eastAsia="Times New Roman" w:hAnsi="Calibri" w:cs="Calibri"/>
-                <w:color w:val="1A1A1A"/>
-                <w:sz w:val="22"/>
-                <w:szCs w:val="22"/>
-              </w:rPr>
-              <w:t>Tangkapan layar: Gambar 2</w:t>
+            <w:proofErr w:type="spellStart"/>
+            <w:r>
+              <w:rPr>
+                <w:rFonts w:ascii="Calibri" w:eastAsia="Times New Roman" w:hAnsi="Calibri" w:cs="Calibri"/>
+                <w:color w:val="1A1A1A"/>
+                <w:sz w:val="22"/>
+                <w:szCs w:val="22"/>
+              </w:rPr>
+              <w:t>Tangkapan</w:t>
+            </w:r>
+            <w:proofErr w:type="spellEnd"/>
+            <w:r>
+              <w:rPr>
+                <w:rFonts w:ascii="Calibri" w:eastAsia="Times New Roman" w:hAnsi="Calibri" w:cs="Calibri"/>
+                <w:color w:val="1A1A1A"/>
+                <w:sz w:val="22"/>
+                <w:szCs w:val="22"/>
+              </w:rPr>
+              <w:t xml:space="preserve"> </w:t>
+            </w:r>
+            <w:proofErr w:type="spellStart"/>
+            <w:r>
+              <w:rPr>
+                <w:rFonts w:ascii="Calibri" w:eastAsia="Times New Roman" w:hAnsi="Calibri" w:cs="Calibri"/>
+                <w:color w:val="1A1A1A"/>
+                <w:sz w:val="22"/>
+                <w:szCs w:val="22"/>
+              </w:rPr>
+              <w:t>layar</w:t>
+            </w:r>
+            <w:proofErr w:type="spellEnd"/>
+            <w:r>
+              <w:rPr>
+                <w:rFonts w:ascii="Calibri" w:eastAsia="Times New Roman" w:hAnsi="Calibri" w:cs="Calibri"/>
+                <w:color w:val="1A1A1A"/>
+                <w:sz w:val="22"/>
+                <w:szCs w:val="22"/>
+              </w:rPr>
+              <w:t>: Gambar 2</w:t>
             </w:r>
           </w:p>
         </w:tc>
@@ -1956,7 +3136,7 @@
           <w:p>
             <w:pPr>
               <w:spacing w:before="80" w:after="160"/>
-              <w:jc w:val="center"/>
+              <w:jc w:val="both"/>
               <w:rPr>
                 <w:rFonts w:ascii="Calibri" w:eastAsia="Times New Roman" w:hAnsi="Calibri" w:cs="Calibri"/>
                 <w:b/>
@@ -1999,6 +3179,7 @@
           <w:p>
             <w:pPr>
               <w:spacing w:before="80" w:after="160"/>
+              <w:jc w:val="both"/>
               <w:rPr>
                 <w:rFonts w:ascii="Calibri" w:eastAsia="Times New Roman" w:hAnsi="Calibri" w:cs="Calibri"/>
                 <w:color w:val="1A1A1A"/>
@@ -2044,6 +3225,7 @@
           <w:p>
             <w:pPr>
               <w:spacing w:before="80" w:after="160"/>
+              <w:jc w:val="both"/>
               <w:rPr>
                 <w:rFonts w:ascii="Calibri" w:eastAsia="Times New Roman" w:hAnsi="Calibri" w:cs="Calibri"/>
                 <w:color w:val="1A1A1A"/>
@@ -2084,7 +3266,7 @@
           <w:p>
             <w:pPr>
               <w:spacing w:before="80" w:after="160"/>
-              <w:jc w:val="center"/>
+              <w:jc w:val="both"/>
               <w:rPr>
                 <w:rFonts w:ascii="Calibri" w:eastAsia="Times New Roman" w:hAnsi="Calibri" w:cs="Calibri"/>
                 <w:b/>
@@ -2127,6 +3309,7 @@
           <w:p>
             <w:pPr>
               <w:spacing w:before="80" w:after="160"/>
+              <w:jc w:val="both"/>
               <w:rPr>
                 <w:rFonts w:ascii="Calibri" w:eastAsia="Times New Roman" w:hAnsi="Calibri" w:cs="Calibri"/>
                 <w:color w:val="1A1A1A"/>
@@ -2141,7 +3324,47 @@
                 <w:sz w:val="22"/>
                 <w:szCs w:val="22"/>
               </w:rPr>
-              <w:t>Kode terunggah ke GitHub</w:t>
+              <w:t xml:space="preserve">Kode </w:t>
+            </w:r>
+            <w:proofErr w:type="spellStart"/>
+            <w:r>
+              <w:rPr>
+                <w:rFonts w:ascii="Calibri" w:eastAsia="Times New Roman" w:hAnsi="Calibri" w:cs="Calibri"/>
+                <w:color w:val="1A1A1A"/>
+                <w:sz w:val="22"/>
+                <w:szCs w:val="22"/>
+              </w:rPr>
+              <w:t>terunggah</w:t>
+            </w:r>
+            <w:proofErr w:type="spellEnd"/>
+            <w:r>
+              <w:rPr>
+                <w:rFonts w:ascii="Calibri" w:eastAsia="Times New Roman" w:hAnsi="Calibri" w:cs="Calibri"/>
+                <w:color w:val="1A1A1A"/>
+                <w:sz w:val="22"/>
+                <w:szCs w:val="22"/>
+              </w:rPr>
+              <w:t xml:space="preserve"> </w:t>
+            </w:r>
+            <w:proofErr w:type="spellStart"/>
+            <w:r>
+              <w:rPr>
+                <w:rFonts w:ascii="Calibri" w:eastAsia="Times New Roman" w:hAnsi="Calibri" w:cs="Calibri"/>
+                <w:color w:val="1A1A1A"/>
+                <w:sz w:val="22"/>
+                <w:szCs w:val="22"/>
+              </w:rPr>
+              <w:t>ke</w:t>
+            </w:r>
+            <w:proofErr w:type="spellEnd"/>
+            <w:r>
+              <w:rPr>
+                <w:rFonts w:ascii="Calibri" w:eastAsia="Times New Roman" w:hAnsi="Calibri" w:cs="Calibri"/>
+                <w:color w:val="1A1A1A"/>
+                <w:sz w:val="22"/>
+                <w:szCs w:val="22"/>
+              </w:rPr>
+              <w:t xml:space="preserve"> GitHub</w:t>
             </w:r>
           </w:p>
         </w:tc>
@@ -2165,6 +3388,7 @@
           <w:p>
             <w:pPr>
               <w:spacing w:before="80" w:after="160"/>
+              <w:jc w:val="both"/>
               <w:rPr>
                 <w:rFonts w:ascii="Calibri" w:eastAsia="Times New Roman" w:hAnsi="Calibri" w:cs="Calibri"/>
                 <w:color w:val="1A1A1A"/>
@@ -2188,6 +3412,7 @@
     <w:p>
       <w:pPr>
         <w:pStyle w:val="Heading3"/>
+        <w:jc w:val="both"/>
         <w:rPr>
           <w:rFonts w:ascii="Calibri" w:eastAsia="Times New Roman" w:hAnsi="Calibri" w:cs="Calibri"/>
           <w:lang w:val="id-ID"/>
@@ -2211,6 +3436,7 @@
     <w:p>
       <w:pPr>
         <w:pStyle w:val="NormalWeb"/>
+        <w:jc w:val="both"/>
         <w:rPr>
           <w:rFonts w:ascii="Calibri" w:hAnsi="Calibri" w:cs="Calibri"/>
           <w:color w:val="1A1A1A"/>
@@ -2281,6 +3507,7 @@
     <w:p>
       <w:pPr>
         <w:pStyle w:val="NormalWeb"/>
+        <w:jc w:val="both"/>
         <w:rPr>
           <w:rFonts w:ascii="Calibri" w:hAnsi="Calibri" w:cs="Calibri"/>
           <w:color w:val="1A1A1A"/>
@@ -2303,6 +3530,7 @@
     <w:p>
       <w:pPr>
         <w:pStyle w:val="Heading3"/>
+        <w:jc w:val="both"/>
         <w:rPr>
           <w:rFonts w:ascii="Calibri" w:eastAsia="Times New Roman" w:hAnsi="Calibri" w:cs="Calibri"/>
           <w:lang w:val="id-ID"/>
@@ -2319,6 +3547,7 @@
     <w:p>
       <w:pPr>
         <w:pStyle w:val="NormalWeb"/>
+        <w:jc w:val="both"/>
         <w:rPr>
           <w:rFonts w:ascii="Calibri" w:hAnsi="Calibri" w:cs="Calibri"/>
           <w:color w:val="1A1A1A"/>
@@ -2336,6 +3565,7 @@
           <w:szCs w:val="22"/>
           <w:lang w:val="id-ID"/>
         </w:rPr>
+        <w:lastRenderedPageBreak/>
         <w:drawing>
           <wp:inline distT="0" distB="0" distL="0" distR="0" wp14:anchorId="5EC0B2B2" wp14:editId="4AE6AD73">
             <wp:extent cx="1905000" cy="4121150"/>
@@ -2389,6 +3619,7 @@
     <w:p>
       <w:pPr>
         <w:pStyle w:val="Heading3"/>
+        <w:jc w:val="both"/>
         <w:rPr>
           <w:rFonts w:ascii="Calibri" w:eastAsia="Times New Roman" w:hAnsi="Calibri" w:cs="Calibri"/>
           <w:lang w:val="id-ID"/>
@@ -2405,6 +3636,7 @@
     <w:p>
       <w:pPr>
         <w:pStyle w:val="q"/>
+        <w:jc w:val="both"/>
         <w:rPr>
           <w:rFonts w:ascii="Calibri" w:hAnsi="Calibri" w:cs="Calibri"/>
           <w:color w:val="1A1A1A"/>
@@ -2427,6 +3659,7 @@
     <w:p>
       <w:pPr>
         <w:pStyle w:val="NormalWeb"/>
+        <w:jc w:val="both"/>
         <w:rPr>
           <w:rFonts w:ascii="Calibri" w:hAnsi="Calibri" w:cs="Calibri"/>
           <w:color w:val="1A1A1A"/>
@@ -2527,22 +3760,13 @@
           <w:szCs w:val="22"/>
           <w:lang w:val="id-ID"/>
         </w:rPr>
-        <w:t xml:space="preserve"> </w:t>
-      </w:r>
-      <w:r>
-        <w:rPr>
-          <w:rFonts w:ascii="Calibri" w:hAnsi="Calibri" w:cs="Calibri"/>
-          <w:color w:val="1A1A1A"/>
-          <w:sz w:val="22"/>
-          <w:szCs w:val="22"/>
-          <w:lang w:val="id-ID"/>
-        </w:rPr>
-        <w:t>juga harus dinyalakan agar aplikasi bisa dipasang dari laptop. Kendala lain yang cukup lama adalah build APK pertama gagal karena NDK belum terpasang; setelah NDK 28.2 dipasang lewat SDK Manager, build berhasil.</w:t>
+        <w:t xml:space="preserve"> juga harus dinyalakan agar aplikasi bisa dipasang dari laptop. Kendala lain yang cukup lama adalah build APK pertama gagal karena NDK belum terpasang; setelah NDK 28.2 dipasang lewat SDK Manager, build berhasil.</w:t>
       </w:r>
     </w:p>
     <w:p>
       <w:pPr>
         <w:pStyle w:val="q"/>
+        <w:jc w:val="both"/>
         <w:rPr>
           <w:rFonts w:ascii="Calibri" w:hAnsi="Calibri" w:cs="Calibri"/>
           <w:color w:val="1A1A1A"/>
@@ -2601,6 +3825,7 @@
     <w:p>
       <w:pPr>
         <w:pStyle w:val="NormalWeb"/>
+        <w:jc w:val="both"/>
         <w:rPr>
           <w:rFonts w:ascii="Calibri" w:hAnsi="Calibri" w:cs="Calibri"/>
           <w:color w:val="1A1A1A"/>
@@ -2635,17 +3860,7 @@
           <w:szCs w:val="22"/>
           <w:lang w:val="id-ID"/>
         </w:rPr>
-        <w:t xml:space="preserve"> </w:t>
-      </w:r>
-      <w:r>
-        <w:rPr>
-          <w:rFonts w:ascii="Calibri" w:hAnsi="Calibri" w:cs="Calibri"/>
-          <w:color w:val="1A1A1A"/>
-          <w:sz w:val="22"/>
-          <w:szCs w:val="22"/>
-          <w:lang w:val="id-ID"/>
-        </w:rPr>
-        <w:t xml:space="preserve">(hot reload), yang berubah hanya tampilannya menjadi oranye, sedangkan angka tetap 5. Artinya hot reload hanya menyuntikkan perubahan kode ke aplikasi yang sedang berjalan dan </w:t>
+        <w:t xml:space="preserve"> (hot reload), yang berubah hanya tampilannya menjadi oranye, sedangkan angka tetap 5. Artinya hot reload hanya menyuntikkan perubahan kode ke aplikasi yang sedang berjalan dan </w:t>
       </w:r>
       <w:r>
         <w:rPr>
@@ -2749,6 +3964,7 @@
     <w:p>
       <w:pPr>
         <w:pStyle w:val="q"/>
+        <w:jc w:val="both"/>
         <w:rPr>
           <w:rFonts w:ascii="Calibri" w:hAnsi="Calibri" w:cs="Calibri"/>
           <w:color w:val="1A1A1A"/>
@@ -2771,6 +3987,7 @@
     <w:p>
       <w:pPr>
         <w:pStyle w:val="NormalWeb"/>
+        <w:jc w:val="both"/>
         <w:rPr>
           <w:rFonts w:ascii="Calibri" w:hAnsi="Calibri" w:cs="Calibri"/>
           <w:color w:val="1A1A1A"/>
@@ -2809,22 +4026,24 @@
           <w:szCs w:val="22"/>
           <w:lang w:val="id-ID"/>
         </w:rPr>
-        <w:t>. Dengan satu basis kode, aplikasi bisa dirilis untuk Android dan iOS sekaligus, sehingga biaya dan waktu pengembangan jauh lebih kecil dibanding membuat dua aplikasi native. Performanya tetap mendekati native, berbeda dengan hybrid yang sering terasa lambat seperti situs web. Selain itu, sebagian besar pengguna di Indonesia memakai Android (sekitar 79%), jadi aplikasi bisa diuji dan dirilis di Android lebih dulu, lalu iOS menyusul dari kode yang sama. Fitur seperti katalog produk, keranjang, dan pembayaran</w:t>
-      </w:r>
-      <w:r>
-        <w:rPr>
-          <w:rFonts w:ascii="Calibri" w:hAnsi="Calibri" w:cs="Calibri"/>
-          <w:color w:val="1A1A1A"/>
-          <w:sz w:val="22"/>
-          <w:szCs w:val="22"/>
-          <w:lang w:val="id-ID"/>
-        </w:rPr>
-        <w:t xml:space="preserve"> juga sudah banyak didukung paket di pub.dev.</w:t>
+        <w:t xml:space="preserve">. Dengan satu basis kode, aplikasi bisa dirilis untuk Android dan iOS sekaligus, sehingga biaya dan waktu pengembangan jauh lebih kecil dibanding membuat dua aplikasi native. Performanya tetap mendekati native, berbeda dengan hybrid yang sering terasa lambat seperti situs web. Selain itu, sebagian besar pengguna di Indonesia memakai Android (sekitar 79%), jadi aplikasi bisa diuji dan dirilis di Android lebih dulu, lalu iOS menyusul dari </w:t>
+      </w:r>
+      <w:r>
+        <w:rPr>
+          <w:rFonts w:ascii="Calibri" w:hAnsi="Calibri" w:cs="Calibri"/>
+          <w:color w:val="1A1A1A"/>
+          <w:sz w:val="22"/>
+          <w:szCs w:val="22"/>
+          <w:lang w:val="id-ID"/>
+        </w:rPr>
+        <w:lastRenderedPageBreak/>
+        <w:t>kode yang sama. Fitur seperti katalog produk, keranjang, dan pembayaran juga sudah banyak didukung paket di pub.dev.</w:t>
       </w:r>
     </w:p>
     <w:p>
       <w:pPr>
         <w:pStyle w:val="Heading2"/>
+        <w:jc w:val="both"/>
         <w:rPr>
           <w:rFonts w:ascii="Calibri" w:eastAsia="Times New Roman" w:hAnsi="Calibri" w:cs="Calibri"/>
           <w:lang w:val="id-ID"/>
@@ -2841,6 +4060,7 @@
     <w:p>
       <w:pPr>
         <w:pStyle w:val="NormalWeb"/>
+        <w:jc w:val="both"/>
         <w:rPr>
           <w:rFonts w:ascii="Calibri" w:hAnsi="Calibri" w:cs="Calibri"/>
           <w:color w:val="1A1A1A"/>
@@ -2857,7 +4077,127 @@
           <w:szCs w:val="22"/>
           <w:lang w:val="id-ID"/>
         </w:rPr>
-        <w:t>Saya menggunakan asisten AI untuk membantu memeriksa kebutuhan dan memasang environment, mendiagnosis galat (NDK belum terpasang dan virtualisasi BIOS nonaktif), serta merapikan lembar kerja ini. Aplikasi dijalankan di perangkat nyata, dan tangkapan layar diambil dari hasil yang sebenarnya.</w:t>
+        <w:t xml:space="preserve">Saya </w:t>
+      </w:r>
+      <w:r>
+        <w:rPr>
+          <w:rFonts w:ascii="Calibri" w:hAnsi="Calibri" w:cs="Calibri"/>
+          <w:color w:val="1A1A1A"/>
+          <w:sz w:val="22"/>
+          <w:szCs w:val="22"/>
+          <w:lang w:val="id-ID"/>
+        </w:rPr>
+        <w:t>pakai</w:t>
+      </w:r>
+      <w:r>
+        <w:rPr>
+          <w:rFonts w:ascii="Calibri" w:hAnsi="Calibri" w:cs="Calibri"/>
+          <w:color w:val="1A1A1A"/>
+          <w:sz w:val="22"/>
+          <w:szCs w:val="22"/>
+          <w:lang w:val="id-ID"/>
+        </w:rPr>
+        <w:t xml:space="preserve"> asisten AI untuk </w:t>
+      </w:r>
+      <w:r>
+        <w:rPr>
+          <w:rFonts w:ascii="Calibri" w:hAnsi="Calibri" w:cs="Calibri"/>
+          <w:color w:val="1A1A1A"/>
+          <w:sz w:val="22"/>
+          <w:szCs w:val="22"/>
+          <w:lang w:val="id-ID"/>
+        </w:rPr>
+        <w:t>sedikit tugas</w:t>
+      </w:r>
+      <w:r>
+        <w:rPr>
+          <w:rFonts w:ascii="Calibri" w:hAnsi="Calibri" w:cs="Calibri"/>
+          <w:color w:val="1A1A1A"/>
+          <w:sz w:val="22"/>
+          <w:szCs w:val="22"/>
+          <w:lang w:val="id-ID"/>
+        </w:rPr>
+        <w:t xml:space="preserve">, </w:t>
+      </w:r>
+      <w:r>
+        <w:rPr>
+          <w:rFonts w:ascii="Calibri" w:hAnsi="Calibri" w:cs="Calibri"/>
+          <w:color w:val="1A1A1A"/>
+          <w:sz w:val="22"/>
+          <w:szCs w:val="22"/>
+          <w:lang w:val="id-ID"/>
+        </w:rPr>
+        <w:t>melihat error</w:t>
+      </w:r>
+      <w:r>
+        <w:rPr>
+          <w:rFonts w:ascii="Calibri" w:hAnsi="Calibri" w:cs="Calibri"/>
+          <w:color w:val="1A1A1A"/>
+          <w:sz w:val="22"/>
+          <w:szCs w:val="22"/>
+          <w:lang w:val="id-ID"/>
+        </w:rPr>
+        <w:t xml:space="preserve">, </w:t>
+      </w:r>
+      <w:r>
+        <w:rPr>
+          <w:rFonts w:ascii="Calibri" w:hAnsi="Calibri" w:cs="Calibri"/>
+          <w:color w:val="1A1A1A"/>
+          <w:sz w:val="22"/>
+          <w:szCs w:val="22"/>
+          <w:lang w:val="id-ID"/>
+        </w:rPr>
+        <w:t>dan</w:t>
+      </w:r>
+      <w:r>
+        <w:rPr>
+          <w:rFonts w:ascii="Calibri" w:hAnsi="Calibri" w:cs="Calibri"/>
+          <w:color w:val="1A1A1A"/>
+          <w:sz w:val="22"/>
+          <w:szCs w:val="22"/>
+          <w:lang w:val="id-ID"/>
+        </w:rPr>
+        <w:t xml:space="preserve"> merapikan lembar kerja ini. Aplikasi dijalankan di perangkat nyata, dan tangkapan layar </w:t>
+      </w:r>
+      <w:r>
+        <w:rPr>
+          <w:rFonts w:ascii="Calibri" w:hAnsi="Calibri" w:cs="Calibri"/>
+          <w:color w:val="1A1A1A"/>
+          <w:sz w:val="22"/>
+          <w:szCs w:val="22"/>
+          <w:lang w:val="id-ID"/>
+        </w:rPr>
+        <w:t>langsung saya ambil</w:t>
+      </w:r>
+      <w:r>
+        <w:rPr>
+          <w:rFonts w:ascii="Calibri" w:hAnsi="Calibri" w:cs="Calibri"/>
+          <w:color w:val="1A1A1A"/>
+          <w:sz w:val="22"/>
+          <w:szCs w:val="22"/>
+          <w:lang w:val="id-ID"/>
+        </w:rPr>
+        <w:t xml:space="preserve"> dari hasil yang </w:t>
+      </w:r>
+      <w:r>
+        <w:rPr>
+          <w:rFonts w:ascii="Calibri" w:hAnsi="Calibri" w:cs="Calibri"/>
+          <w:color w:val="1A1A1A"/>
+          <w:sz w:val="22"/>
+          <w:szCs w:val="22"/>
+          <w:lang w:val="id-ID"/>
+        </w:rPr>
+        <w:t>dikerjakan</w:t>
+      </w:r>
+      <w:r>
+        <w:rPr>
+          <w:rFonts w:ascii="Calibri" w:hAnsi="Calibri" w:cs="Calibri"/>
+          <w:color w:val="1A1A1A"/>
+          <w:sz w:val="22"/>
+          <w:szCs w:val="22"/>
+          <w:lang w:val="id-ID"/>
+        </w:rPr>
+        <w:t>.</w:t>
       </w:r>
     </w:p>
     <w:sectPr>

</xml_diff>